<commit_message>
Script ftp primera version funcional
</commit_message>
<xml_diff>
--- a/Documentacion/PDFs/Tarea2.docx
+++ b/Documentacion/PDFs/Tarea2.docx
@@ -244,19 +244,17 @@
           <w:sz w:val="36"/>
           <w:szCs w:val="36"/>
         </w:rPr>
-        <w:t>Practica 1</w:t>
-      </w:r>
-    </w:p>
-    <w:p>
-      <w:pPr>
-        <w:jc w:val="center"/>
+        <w:t xml:space="preserve">Practica </w:t>
+      </w:r>
+      <w:r>
         <w:rPr>
           <w:b/>
           <w:bCs/>
           <w:sz w:val="36"/>
           <w:szCs w:val="36"/>
         </w:rPr>
-      </w:pPr>
+        <w:t>4</w:t>
+      </w:r>
     </w:p>
     <w:p>
       <w:pPr>
@@ -268,35 +266,37 @@
           <w:szCs w:val="36"/>
         </w:rPr>
       </w:pPr>
-      <w:r>
+    </w:p>
+    <w:p>
+      <w:pPr>
+        <w:jc w:val="center"/>
         <w:rPr>
           <w:b/>
           <w:bCs/>
           <w:sz w:val="36"/>
           <w:szCs w:val="36"/>
         </w:rPr>
-        <w:t>Nombre del profesor:</w:t>
-      </w:r>
-    </w:p>
-    <w:p>
-      <w:pPr>
-        <w:jc w:val="center"/>
+      </w:pPr>
+      <w:r>
         <w:rPr>
           <w:b/>
           <w:bCs/>
           <w:sz w:val="36"/>
           <w:szCs w:val="36"/>
         </w:rPr>
-      </w:pPr>
-      <w:r>
+        <w:t>Nombre del profesor:</w:t>
+      </w:r>
+    </w:p>
+    <w:p>
+      <w:pPr>
+        <w:jc w:val="center"/>
         <w:rPr>
           <w:b/>
           <w:bCs/>
           <w:sz w:val="36"/>
           <w:szCs w:val="36"/>
         </w:rPr>
-        <w:t>Herman G</w:t>
-      </w:r>
+      </w:pPr>
       <w:r>
         <w:rPr>
           <w:b/>
@@ -304,19 +304,17 @@
           <w:sz w:val="36"/>
           <w:szCs w:val="36"/>
         </w:rPr>
-        <w:t>iovany Ayala Zuñiga</w:t>
-      </w:r>
-    </w:p>
-    <w:p>
-      <w:pPr>
-        <w:jc w:val="center"/>
+        <w:t>Herman G</w:t>
+      </w:r>
+      <w:r>
         <w:rPr>
           <w:b/>
           <w:bCs/>
           <w:sz w:val="36"/>
           <w:szCs w:val="36"/>
         </w:rPr>
-      </w:pPr>
+        <w:t>iovany Ayala Zuñiga</w:t>
+      </w:r>
     </w:p>
     <w:p>
       <w:pPr>
@@ -328,46 +326,46 @@
           <w:szCs w:val="36"/>
         </w:rPr>
       </w:pPr>
-      <w:r>
+    </w:p>
+    <w:p>
+      <w:pPr>
+        <w:jc w:val="center"/>
         <w:rPr>
           <w:b/>
           <w:bCs/>
           <w:sz w:val="36"/>
           <w:szCs w:val="36"/>
         </w:rPr>
-        <w:t>Nombre del alumno:</w:t>
-      </w:r>
-    </w:p>
-    <w:p>
-      <w:pPr>
-        <w:jc w:val="center"/>
+      </w:pPr>
+      <w:r>
         <w:rPr>
           <w:b/>
           <w:bCs/>
           <w:sz w:val="36"/>
           <w:szCs w:val="36"/>
         </w:rPr>
-      </w:pPr>
-      <w:r>
+        <w:t>Nombre del alumno:</w:t>
+      </w:r>
+    </w:p>
+    <w:p>
+      <w:pPr>
+        <w:jc w:val="center"/>
         <w:rPr>
           <w:b/>
           <w:bCs/>
           <w:sz w:val="36"/>
           <w:szCs w:val="36"/>
         </w:rPr>
-        <w:t>Daniel Humberto Leyva Chavez</w:t>
-      </w:r>
-    </w:p>
-    <w:p>
-      <w:pPr>
-        <w:jc w:val="center"/>
+      </w:pPr>
+      <w:r>
         <w:rPr>
           <w:b/>
           <w:bCs/>
           <w:sz w:val="36"/>
           <w:szCs w:val="36"/>
         </w:rPr>
-      </w:pPr>
+        <w:t>Daniel Humberto Leyva Chavez</w:t>
+      </w:r>
     </w:p>
     <w:p>
       <w:pPr>
@@ -379,34 +377,45 @@
           <w:szCs w:val="36"/>
         </w:rPr>
       </w:pPr>
-      <w:r>
+    </w:p>
+    <w:p>
+      <w:pPr>
+        <w:jc w:val="center"/>
         <w:rPr>
           <w:b/>
           <w:bCs/>
           <w:sz w:val="36"/>
           <w:szCs w:val="36"/>
         </w:rPr>
-        <w:t>Fecha:</w:t>
-      </w:r>
-    </w:p>
-    <w:p>
-      <w:pPr>
-        <w:jc w:val="center"/>
+      </w:pPr>
+      <w:r>
         <w:rPr>
           <w:b/>
           <w:bCs/>
           <w:sz w:val="36"/>
           <w:szCs w:val="36"/>
         </w:rPr>
-      </w:pPr>
-      <w:r>
+        <w:t>Fecha:</w:t>
+      </w:r>
+    </w:p>
+    <w:p>
+      <w:pPr>
+        <w:jc w:val="center"/>
         <w:rPr>
           <w:b/>
           <w:bCs/>
           <w:sz w:val="36"/>
           <w:szCs w:val="36"/>
         </w:rPr>
-        <w:t>13</w:t>
+      </w:pPr>
+      <w:r>
+        <w:rPr>
+          <w:b/>
+          <w:bCs/>
+          <w:sz w:val="36"/>
+          <w:szCs w:val="36"/>
+        </w:rPr>
+        <w:t>25</w:t>
       </w:r>
       <w:r>
         <w:rPr>
@@ -540,7 +549,7 @@
               <w:rPr>
                 <w:rFonts w:ascii="Arial" w:hAnsi="Arial" w:cs="Arial"/>
               </w:rPr>
-              <w:t>Script de tarea 2 incompleto</w:t>
+              <w:t>Prueba de modularizacion DHCP y DNS Linux</w:t>
             </w:r>
           </w:p>
         </w:tc>
@@ -583,7 +592,7 @@
               <w:rPr>
                 <w:rFonts w:ascii="Arial" w:hAnsi="Arial" w:cs="Arial"/>
               </w:rPr>
-              <w:t>Prototipo DHCP</w:t>
+              <w:t>Corrección a implementar librerías en DNS Linux</w:t>
             </w:r>
           </w:p>
         </w:tc>
@@ -626,7 +635,7 @@
               <w:rPr>
                 <w:rFonts w:ascii="Arial" w:hAnsi="Arial" w:cs="Arial"/>
               </w:rPr>
-              <w:t>Script Linux V2</w:t>
+              <w:t>Corrección de sintaxis en DNS Linux</w:t>
             </w:r>
           </w:p>
         </w:tc>
@@ -669,7 +678,7 @@
               <w:rPr>
                 <w:rFonts w:ascii="Arial" w:hAnsi="Arial" w:cs="Arial"/>
               </w:rPr>
-              <w:t>Script Linux V2.1</w:t>
+              <w:t>Script ssh prueba Linux</w:t>
             </w:r>
           </w:p>
         </w:tc>
@@ -712,7 +721,13 @@
               <w:rPr>
                 <w:rFonts w:ascii="Arial" w:hAnsi="Arial" w:cs="Arial"/>
               </w:rPr>
-              <w:t>Script Linux V2.1</w:t>
+              <w:t>C</w:t>
+            </w:r>
+            <w:r>
+              <w:t>orre</w:t>
+            </w:r>
+            <w:r>
+              <w:t>cción de la ruta script ssh Linux</w:t>
             </w:r>
           </w:p>
         </w:tc>
@@ -755,7 +770,7 @@
               <w:rPr>
                 <w:rFonts w:ascii="Arial" w:hAnsi="Arial" w:cs="Arial"/>
               </w:rPr>
-              <w:t>Script Linux V2.2</w:t>
+              <w:t>Corrección de la toma de interfaz de red en ssh Linux</w:t>
             </w:r>
           </w:p>
         </w:tc>
@@ -798,7 +813,7 @@
               <w:rPr>
                 <w:rFonts w:ascii="Arial" w:hAnsi="Arial" w:cs="Arial"/>
               </w:rPr>
-              <w:t>Script Linux V2.3</w:t>
+              <w:t>Optimización scripts de Windows</w:t>
             </w:r>
           </w:p>
         </w:tc>
@@ -822,7 +837,7 @@
               <w:rPr>
                 <w:rFonts w:ascii="Arial" w:hAnsi="Arial" w:cs="Arial"/>
               </w:rPr>
-              <w:t>Commit 8</w:t>
+              <w:t xml:space="preserve">Commit 8 </w:t>
             </w:r>
           </w:p>
         </w:tc>
@@ -841,7 +856,7 @@
               <w:rPr>
                 <w:rFonts w:ascii="Arial" w:hAnsi="Arial" w:cs="Arial"/>
               </w:rPr>
-              <w:t>Script Linux V3</w:t>
+              <w:t>Script Windows ssh</w:t>
             </w:r>
           </w:p>
         </w:tc>
@@ -884,7 +899,7 @@
               <w:rPr>
                 <w:rFonts w:ascii="Arial" w:hAnsi="Arial" w:cs="Arial"/>
               </w:rPr>
-              <w:t>Script Linux V3.1</w:t>
+              <w:t>Script Windows ssh 2</w:t>
             </w:r>
           </w:p>
         </w:tc>
@@ -927,7 +942,7 @@
               <w:rPr>
                 <w:rFonts w:ascii="Arial" w:hAnsi="Arial" w:cs="Arial"/>
               </w:rPr>
-              <w:t>Script Linux V3.2</w:t>
+              <w:t>Script de menú Linux</w:t>
             </w:r>
           </w:p>
         </w:tc>
@@ -970,352 +985,7 @@
               <w:rPr>
                 <w:rFonts w:ascii="Arial" w:hAnsi="Arial" w:cs="Arial"/>
               </w:rPr>
-              <w:t>Script Linux V3.2</w:t>
-            </w:r>
-          </w:p>
-        </w:tc>
-      </w:tr>
-      <w:tr>
-        <w:trPr>
-          <w:trHeight w:val="402"/>
-        </w:trPr>
-        <w:tc>
-          <w:tcPr>
-            <w:tcW w:w="2405" w:type="dxa"/>
-          </w:tcPr>
-          <w:p>
-            <w:pPr>
-              <w:jc w:val="center"/>
-              <w:rPr>
-                <w:rFonts w:ascii="Arial" w:hAnsi="Arial" w:cs="Arial"/>
-              </w:rPr>
-            </w:pPr>
-            <w:r>
-              <w:rPr>
-                <w:rFonts w:ascii="Arial" w:hAnsi="Arial" w:cs="Arial"/>
-              </w:rPr>
-              <w:t>Commit 12</w:t>
-            </w:r>
-          </w:p>
-        </w:tc>
-        <w:tc>
-          <w:tcPr>
-            <w:tcW w:w="6423" w:type="dxa"/>
-          </w:tcPr>
-          <w:p>
-            <w:pPr>
-              <w:jc w:val="center"/>
-              <w:rPr>
-                <w:rFonts w:ascii="Arial" w:hAnsi="Arial" w:cs="Arial"/>
-              </w:rPr>
-            </w:pPr>
-            <w:r>
-              <w:rPr>
-                <w:rFonts w:ascii="Arial" w:hAnsi="Arial" w:cs="Arial"/>
-              </w:rPr>
-              <w:t>Script Linux VFinal</w:t>
-            </w:r>
-          </w:p>
-        </w:tc>
-      </w:tr>
-      <w:tr>
-        <w:trPr>
-          <w:trHeight w:val="402"/>
-        </w:trPr>
-        <w:tc>
-          <w:tcPr>
-            <w:tcW w:w="2405" w:type="dxa"/>
-          </w:tcPr>
-          <w:p>
-            <w:pPr>
-              <w:jc w:val="center"/>
-              <w:rPr>
-                <w:rFonts w:ascii="Arial" w:hAnsi="Arial" w:cs="Arial"/>
-              </w:rPr>
-            </w:pPr>
-            <w:r>
-              <w:rPr>
-                <w:rFonts w:ascii="Arial" w:hAnsi="Arial" w:cs="Arial"/>
-              </w:rPr>
-              <w:t>Commit 13</w:t>
-            </w:r>
-          </w:p>
-        </w:tc>
-        <w:tc>
-          <w:tcPr>
-            <w:tcW w:w="6423" w:type="dxa"/>
-          </w:tcPr>
-          <w:p>
-            <w:pPr>
-              <w:jc w:val="center"/>
-              <w:rPr>
-                <w:rFonts w:ascii="Arial" w:hAnsi="Arial" w:cs="Arial"/>
-              </w:rPr>
-            </w:pPr>
-            <w:r>
-              <w:rPr>
-                <w:rFonts w:ascii="Arial" w:hAnsi="Arial" w:cs="Arial"/>
-              </w:rPr>
-              <w:t>Script Linux Vfinal2</w:t>
-            </w:r>
-          </w:p>
-        </w:tc>
-      </w:tr>
-      <w:tr>
-        <w:trPr>
-          <w:trHeight w:val="402"/>
-        </w:trPr>
-        <w:tc>
-          <w:tcPr>
-            <w:tcW w:w="2405" w:type="dxa"/>
-          </w:tcPr>
-          <w:p>
-            <w:pPr>
-              <w:jc w:val="center"/>
-              <w:rPr>
-                <w:rFonts w:ascii="Arial" w:hAnsi="Arial" w:cs="Arial"/>
-              </w:rPr>
-            </w:pPr>
-            <w:r>
-              <w:rPr>
-                <w:rFonts w:ascii="Arial" w:hAnsi="Arial" w:cs="Arial"/>
-              </w:rPr>
-              <w:t>Commit 14</w:t>
-            </w:r>
-          </w:p>
-        </w:tc>
-        <w:tc>
-          <w:tcPr>
-            <w:tcW w:w="6423" w:type="dxa"/>
-          </w:tcPr>
-          <w:p>
-            <w:pPr>
-              <w:jc w:val="center"/>
-              <w:rPr>
-                <w:rFonts w:ascii="Arial" w:hAnsi="Arial" w:cs="Arial"/>
-              </w:rPr>
-            </w:pPr>
-            <w:r>
-              <w:rPr>
-                <w:rFonts w:ascii="Arial" w:hAnsi="Arial" w:cs="Arial"/>
-              </w:rPr>
-              <w:t>Script Linux Versión Final</w:t>
-            </w:r>
-          </w:p>
-        </w:tc>
-      </w:tr>
-      <w:tr>
-        <w:trPr>
-          <w:trHeight w:val="402"/>
-        </w:trPr>
-        <w:tc>
-          <w:tcPr>
-            <w:tcW w:w="2405" w:type="dxa"/>
-          </w:tcPr>
-          <w:p>
-            <w:pPr>
-              <w:jc w:val="center"/>
-              <w:rPr>
-                <w:rFonts w:ascii="Arial" w:hAnsi="Arial" w:cs="Arial"/>
-              </w:rPr>
-            </w:pPr>
-            <w:r>
-              <w:rPr>
-                <w:rFonts w:ascii="Arial" w:hAnsi="Arial" w:cs="Arial"/>
-              </w:rPr>
-              <w:t>Commit 15</w:t>
-            </w:r>
-          </w:p>
-        </w:tc>
-        <w:tc>
-          <w:tcPr>
-            <w:tcW w:w="6423" w:type="dxa"/>
-          </w:tcPr>
-          <w:p>
-            <w:pPr>
-              <w:jc w:val="center"/>
-              <w:rPr>
-                <w:rFonts w:ascii="Arial" w:hAnsi="Arial" w:cs="Arial"/>
-              </w:rPr>
-            </w:pPr>
-            <w:r>
-              <w:rPr>
-                <w:rFonts w:ascii="Arial" w:hAnsi="Arial" w:cs="Arial"/>
-              </w:rPr>
-              <w:t xml:space="preserve">Script Windows Versión Preliminar 1 </w:t>
-            </w:r>
-          </w:p>
-        </w:tc>
-      </w:tr>
-      <w:tr>
-        <w:trPr>
-          <w:trHeight w:val="402"/>
-        </w:trPr>
-        <w:tc>
-          <w:tcPr>
-            <w:tcW w:w="2405" w:type="dxa"/>
-          </w:tcPr>
-          <w:p>
-            <w:pPr>
-              <w:jc w:val="center"/>
-              <w:rPr>
-                <w:rFonts w:ascii="Arial" w:hAnsi="Arial" w:cs="Arial"/>
-              </w:rPr>
-            </w:pPr>
-            <w:r>
-              <w:rPr>
-                <w:rFonts w:ascii="Arial" w:hAnsi="Arial" w:cs="Arial"/>
-              </w:rPr>
-              <w:t>Commit 16</w:t>
-            </w:r>
-          </w:p>
-        </w:tc>
-        <w:tc>
-          <w:tcPr>
-            <w:tcW w:w="6423" w:type="dxa"/>
-          </w:tcPr>
-          <w:p>
-            <w:pPr>
-              <w:jc w:val="center"/>
-              <w:rPr>
-                <w:rFonts w:ascii="Arial" w:hAnsi="Arial" w:cs="Arial"/>
-              </w:rPr>
-            </w:pPr>
-            <w:r>
-              <w:rPr>
-                <w:rFonts w:ascii="Arial" w:hAnsi="Arial" w:cs="Arial"/>
-              </w:rPr>
-              <w:t>Script Windows Versión Preliminar 2</w:t>
-            </w:r>
-          </w:p>
-        </w:tc>
-      </w:tr>
-      <w:tr>
-        <w:trPr>
-          <w:trHeight w:val="402"/>
-        </w:trPr>
-        <w:tc>
-          <w:tcPr>
-            <w:tcW w:w="2405" w:type="dxa"/>
-          </w:tcPr>
-          <w:p>
-            <w:pPr>
-              <w:jc w:val="center"/>
-              <w:rPr>
-                <w:rFonts w:ascii="Arial" w:hAnsi="Arial" w:cs="Arial"/>
-              </w:rPr>
-            </w:pPr>
-            <w:r>
-              <w:rPr>
-                <w:rFonts w:ascii="Arial" w:hAnsi="Arial" w:cs="Arial"/>
-              </w:rPr>
-              <w:t>Commit 17</w:t>
-            </w:r>
-          </w:p>
-        </w:tc>
-        <w:tc>
-          <w:tcPr>
-            <w:tcW w:w="6423" w:type="dxa"/>
-          </w:tcPr>
-          <w:p>
-            <w:pPr>
-              <w:jc w:val="center"/>
-              <w:rPr>
-                <w:rFonts w:ascii="Arial" w:hAnsi="Arial" w:cs="Arial"/>
-              </w:rPr>
-            </w:pPr>
-            <w:r>
-              <w:rPr>
-                <w:rFonts w:ascii="Arial" w:hAnsi="Arial" w:cs="Arial"/>
-              </w:rPr>
-              <w:t>Script Windows V1.0</w:t>
-            </w:r>
-          </w:p>
-        </w:tc>
-      </w:tr>
-      <w:tr>
-        <w:trPr>
-          <w:trHeight w:val="402"/>
-        </w:trPr>
-        <w:tc>
-          <w:tcPr>
-            <w:tcW w:w="2405" w:type="dxa"/>
-          </w:tcPr>
-          <w:p>
-            <w:pPr>
-              <w:jc w:val="center"/>
-              <w:rPr>
-                <w:rFonts w:ascii="Arial" w:hAnsi="Arial" w:cs="Arial"/>
-              </w:rPr>
-            </w:pPr>
-            <w:r>
-              <w:rPr>
-                <w:rFonts w:ascii="Arial" w:hAnsi="Arial" w:cs="Arial"/>
-              </w:rPr>
-              <w:t>Commit 18</w:t>
-            </w:r>
-          </w:p>
-        </w:tc>
-        <w:tc>
-          <w:tcPr>
-            <w:tcW w:w="6423" w:type="dxa"/>
-          </w:tcPr>
-          <w:p>
-            <w:pPr>
-              <w:jc w:val="center"/>
-              <w:rPr>
-                <w:rFonts w:ascii="Arial" w:hAnsi="Arial" w:cs="Arial"/>
-              </w:rPr>
-            </w:pPr>
-            <w:r>
-              <w:rPr>
-                <w:rFonts w:ascii="Arial" w:hAnsi="Arial" w:cs="Arial"/>
-              </w:rPr>
-              <w:t>Script Windows Bueno</w:t>
-            </w:r>
-          </w:p>
-        </w:tc>
-      </w:tr>
-      <w:tr>
-        <w:trPr>
-          <w:trHeight w:val="402"/>
-        </w:trPr>
-        <w:tc>
-          <w:tcPr>
-            <w:tcW w:w="2405" w:type="dxa"/>
-          </w:tcPr>
-          <w:p>
-            <w:pPr>
-              <w:jc w:val="center"/>
-              <w:rPr>
-                <w:rFonts w:ascii="Arial" w:hAnsi="Arial" w:cs="Arial"/>
-              </w:rPr>
-            </w:pPr>
-            <w:r>
-              <w:rPr>
-                <w:rFonts w:ascii="Arial" w:hAnsi="Arial" w:cs="Arial"/>
-              </w:rPr>
-              <w:t>Commit 19</w:t>
-            </w:r>
-          </w:p>
-        </w:tc>
-        <w:tc>
-          <w:tcPr>
-            <w:tcW w:w="6423" w:type="dxa"/>
-          </w:tcPr>
-          <w:p>
-            <w:pPr>
-              <w:jc w:val="center"/>
-              <w:rPr>
-                <w:rFonts w:ascii="Arial" w:hAnsi="Arial" w:cs="Arial"/>
-                <w:u w:val="single"/>
-              </w:rPr>
-            </w:pPr>
-            <w:r>
-              <w:rPr>
-                <w:rFonts w:ascii="Arial" w:hAnsi="Arial" w:cs="Arial"/>
-              </w:rPr>
-              <w:t>Script Windows Bueno Final</w:t>
+              <w:t>Nslookup en Windows y Linux</w:t>
             </w:r>
           </w:p>
         </w:tc>
@@ -1388,76 +1058,694 @@
           <w:sz w:val="28"/>
           <w:szCs w:val="28"/>
         </w:rPr>
-        <w:t xml:space="preserve">Se busca crear en lenguaje bash (Linux) y powershell (Windows) un servidor DHCP configurable, donde se valida la IP inicial y final que sea una IP valida, así como también el Gateway y DNS primario y secundario de manera opcional, de esta manera también poder levantar el servidor DHCP </w:t>
-      </w:r>
+        <w:t>Se busca optimizar las practicas anteriores reutilizando código de fusiones que se utilicen en múltiples prácticas, así como también se busca instalar y configurar el servidor ssh en las maquinas servidor para poder conectarse a los servidores desde la maquina host a través de un cliente ssh (</w:t>
+      </w:r>
+      <w:proofErr w:type="spellStart"/>
       <w:r>
         <w:rPr>
           <w:rFonts w:ascii="Arial" w:hAnsi="Arial" w:cs="Arial"/>
           <w:sz w:val="28"/>
           <w:szCs w:val="28"/>
         </w:rPr>
-        <w:t>y asignar IPs de manera automática a los demás dispositivos conectamos a la red.</w:t>
-      </w:r>
-    </w:p>
-    <w:p>
-      <w:pPr>
-        <w:ind w:left="705"/>
+        <w:t>putty</w:t>
+      </w:r>
+      <w:proofErr w:type="spellEnd"/>
+      <w:r>
         <w:rPr>
           <w:rFonts w:ascii="Arial" w:hAnsi="Arial" w:cs="Arial"/>
           <w:sz w:val="28"/>
           <w:szCs w:val="28"/>
         </w:rPr>
-      </w:pPr>
-    </w:p>
-    <w:p>
-      <w:pPr>
-        <w:ind w:left="705"/>
+        <w:t xml:space="preserve"> o algún otro), para esto se tendrá que configurar una nueva interfaz de red de tipo puente en las maquinas servidor</w:t>
+      </w:r>
+      <w:r>
         <w:rPr>
           <w:rFonts w:ascii="Arial" w:hAnsi="Arial" w:cs="Arial"/>
           <w:sz w:val="28"/>
           <w:szCs w:val="28"/>
         </w:rPr>
-      </w:pPr>
-      <w:r>
-        <w:rPr>
-          <w:rFonts w:ascii="Arial" w:hAnsi="Arial" w:cs="Arial"/>
-          <w:b/>
-          <w:bCs/>
+        <w:t xml:space="preserve"> para poder tener una IP en el mismo segmento que la maquina host y de esta maneras poder comunicarlas.</w:t>
+      </w:r>
+    </w:p>
+    <w:p>
+      <w:pPr>
+        <w:ind w:left="705"/>
+        <w:rPr>
+          <w:rFonts w:ascii="Arial" w:hAnsi="Arial" w:cs="Arial"/>
           <w:sz w:val="28"/>
           <w:szCs w:val="28"/>
         </w:rPr>
-        <w:lastRenderedPageBreak/>
-        <w:t>Diagrama de topología:</w:t>
-      </w:r>
-    </w:p>
-    <w:p>
-      <w:pPr>
+      </w:pPr>
+    </w:p>
+    <w:p>
+      <w:pPr>
+        <w:ind w:left="705"/>
         <w:rPr>
           <w:rFonts w:ascii="Arial" w:hAnsi="Arial" w:cs="Arial"/>
           <w:sz w:val="28"/>
           <w:szCs w:val="28"/>
         </w:rPr>
       </w:pPr>
-      <w:r>
-        <w:rPr>
-          <w:rFonts w:ascii="Arial" w:hAnsi="Arial" w:cs="Arial"/>
-          <w:noProof/>
+    </w:p>
+    <w:p>
+      <w:pPr>
+        <w:ind w:left="705"/>
+        <w:rPr>
+          <w:rFonts w:ascii="Arial" w:hAnsi="Arial" w:cs="Arial"/>
           <w:sz w:val="28"/>
           <w:szCs w:val="28"/>
         </w:rPr>
+      </w:pPr>
+    </w:p>
+    <w:p>
+      <w:pPr>
+        <w:ind w:left="705"/>
+        <w:rPr>
+          <w:rFonts w:ascii="Arial" w:hAnsi="Arial" w:cs="Arial"/>
+          <w:sz w:val="28"/>
+          <w:szCs w:val="28"/>
+        </w:rPr>
+      </w:pPr>
+    </w:p>
+    <w:p>
+      <w:pPr>
+        <w:rPr>
+          <w:rFonts w:ascii="Arial" w:hAnsi="Arial" w:cs="Arial"/>
+          <w:sz w:val="28"/>
+          <w:szCs w:val="28"/>
+        </w:rPr>
+      </w:pPr>
+    </w:p>
+    <w:p>
+      <w:pPr>
+        <w:rPr>
+          <w:rFonts w:ascii="Arial" w:hAnsi="Arial" w:cs="Arial"/>
+          <w:sz w:val="28"/>
+          <w:szCs w:val="28"/>
+        </w:rPr>
+      </w:pPr>
+    </w:p>
+    <w:p>
+      <w:pPr>
+        <w:rPr>
+          <w:rFonts w:ascii="Arial" w:hAnsi="Arial" w:cs="Arial"/>
+          <w:b/>
+          <w:bCs/>
+          <w:sz w:val="32"/>
+          <w:szCs w:val="32"/>
+        </w:rPr>
+      </w:pPr>
+      <w:r>
+        <w:rPr>
+          <w:rFonts w:ascii="Arial" w:hAnsi="Arial" w:cs="Arial"/>
+          <w:b/>
+          <w:bCs/>
+          <w:sz w:val="32"/>
+          <w:szCs w:val="32"/>
+        </w:rPr>
+        <w:lastRenderedPageBreak/>
+        <w:t>Guia de uso de Scripts</w:t>
+      </w:r>
+    </w:p>
+    <w:p>
+      <w:pPr>
+        <w:rPr>
+          <w:rFonts w:ascii="Arial" w:hAnsi="Arial" w:cs="Arial"/>
+        </w:rPr>
+      </w:pPr>
+      <w:r>
+        <w:rPr>
+          <w:rFonts w:ascii="Arial" w:hAnsi="Arial" w:cs="Arial"/>
+          <w:b/>
+          <w:bCs/>
+        </w:rPr>
+        <w:t>Requisitos Previos</w:t>
+      </w:r>
+      <w:r>
+        <w:rPr>
+          <w:rFonts w:ascii="Arial" w:hAnsi="Arial" w:cs="Arial"/>
+          <w:b/>
+          <w:bCs/>
+        </w:rPr>
+        <w:t xml:space="preserve">: </w:t>
+      </w:r>
+      <w:r>
+        <w:rPr>
+          <w:rFonts w:ascii="Arial" w:hAnsi="Arial" w:cs="Arial"/>
+        </w:rPr>
+        <w:t>Se deberá ejecutar el script como administrador.</w:t>
+      </w:r>
+    </w:p>
+    <w:p>
+      <w:pPr>
+        <w:rPr>
+          <w:rFonts w:ascii="Arial" w:hAnsi="Arial" w:cs="Arial"/>
+        </w:rPr>
+      </w:pPr>
+      <w:r>
+        <w:rPr>
+          <w:rFonts w:ascii="Arial" w:hAnsi="Arial" w:cs="Arial"/>
+          <w:b/>
+          <w:bCs/>
+        </w:rPr>
+        <w:t>Instrucciones de ejecución:</w:t>
+      </w:r>
+      <w:r>
+        <w:rPr>
+          <w:rFonts w:ascii="Arial" w:hAnsi="Arial" w:cs="Arial"/>
+          <w:b/>
+          <w:bCs/>
+        </w:rPr>
+        <w:t xml:space="preserve"> </w:t>
+      </w:r>
+    </w:p>
+    <w:p>
+      <w:pPr>
+        <w:rPr>
+          <w:rFonts w:ascii="Arial" w:hAnsi="Arial" w:cs="Arial"/>
+        </w:rPr>
+      </w:pPr>
+      <w:r>
+        <w:rPr>
+          <w:rFonts w:ascii="Arial" w:hAnsi="Arial" w:cs="Arial"/>
+        </w:rPr>
+        <w:t xml:space="preserve">Comando exacto en Linux: </w:t>
+      </w:r>
+      <w:r>
+        <w:rPr>
+          <w:rFonts w:ascii="Arial" w:hAnsi="Arial" w:cs="Arial"/>
+        </w:rPr>
+        <w:t>sudo sh script-ssh.sh -?</w:t>
+      </w:r>
+    </w:p>
+    <w:p>
+      <w:pPr>
+        <w:rPr>
+          <w:rFonts w:ascii="Arial" w:hAnsi="Arial" w:cs="Arial"/>
+        </w:rPr>
+      </w:pPr>
+      <w:r>
+        <w:rPr>
+          <w:rFonts w:ascii="Arial" w:hAnsi="Arial" w:cs="Arial"/>
+        </w:rPr>
+        <w:t>Comando exacto en Windows: .\</w:t>
+      </w:r>
+      <w:r>
+        <w:rPr>
+          <w:rFonts w:ascii="Arial" w:hAnsi="Arial" w:cs="Arial"/>
+        </w:rPr>
+        <w:t>tarea4.ps1</w:t>
+      </w:r>
+    </w:p>
+    <w:p>
+      <w:pPr>
+        <w:rPr>
+          <w:rFonts w:ascii="Arial" w:hAnsi="Arial" w:cs="Arial"/>
+          <w:b/>
+          <w:bCs/>
+        </w:rPr>
+      </w:pPr>
+      <w:r>
+        <w:rPr>
+          <w:rFonts w:ascii="Arial" w:hAnsi="Arial" w:cs="Arial"/>
+          <w:b/>
+          <w:bCs/>
+        </w:rPr>
+        <w:t xml:space="preserve">Flujo de </w:t>
+      </w:r>
+      <w:r>
+        <w:rPr>
+          <w:rFonts w:ascii="Arial" w:hAnsi="Arial" w:cs="Arial"/>
+          <w:b/>
+          <w:bCs/>
+        </w:rPr>
+        <w:t>interacción</w:t>
+      </w:r>
+      <w:r>
+        <w:rPr>
+          <w:rFonts w:ascii="Arial" w:hAnsi="Arial" w:cs="Arial"/>
+          <w:b/>
+          <w:bCs/>
+        </w:rPr>
+        <w:t>:</w:t>
+      </w:r>
+    </w:p>
+    <w:p>
+      <w:pPr>
+        <w:pStyle w:val="Prrafodelista"/>
+        <w:numPr>
+          <w:ilvl w:val="0"/>
+          <w:numId w:val="2"/>
+        </w:numPr>
+        <w:rPr>
+          <w:rFonts w:ascii="Arial" w:hAnsi="Arial" w:cs="Arial"/>
+        </w:rPr>
+      </w:pPr>
+      <w:r>
+        <w:rPr>
+          <w:rFonts w:ascii="Arial" w:hAnsi="Arial" w:cs="Arial"/>
+        </w:rPr>
+        <w:t>El script mostrara un menú con opciones disponibles</w:t>
+      </w:r>
+      <w:r>
+        <w:rPr>
+          <w:rFonts w:ascii="Arial" w:hAnsi="Arial" w:cs="Arial"/>
+        </w:rPr>
+        <w:t xml:space="preserve"> para ejecutar en tipo función (-v, -i, -r, -?)</w:t>
+      </w:r>
+      <w:r>
+        <w:rPr>
+          <w:rFonts w:ascii="Arial" w:hAnsi="Arial" w:cs="Arial"/>
+        </w:rPr>
+        <w:t>.</w:t>
+      </w:r>
+    </w:p>
+    <w:p>
+      <w:pPr>
+        <w:pStyle w:val="Prrafodelista"/>
+        <w:numPr>
+          <w:ilvl w:val="0"/>
+          <w:numId w:val="2"/>
+        </w:numPr>
+        <w:rPr>
+          <w:rFonts w:ascii="Arial" w:hAnsi="Arial" w:cs="Arial"/>
+        </w:rPr>
+      </w:pPr>
+      <w:r>
+        <w:rPr>
+          <w:rFonts w:ascii="Arial" w:hAnsi="Arial" w:cs="Arial"/>
+        </w:rPr>
+        <w:t xml:space="preserve">El usuario deberá elegir una opción, en caso de elegir una </w:t>
+      </w:r>
+      <w:r>
+        <w:rPr>
+          <w:rFonts w:ascii="Arial" w:hAnsi="Arial" w:cs="Arial"/>
+        </w:rPr>
+        <w:t>opción</w:t>
+      </w:r>
+      <w:r>
+        <w:rPr>
+          <w:rFonts w:ascii="Arial" w:hAnsi="Arial" w:cs="Arial"/>
+        </w:rPr>
+        <w:t xml:space="preserve"> que no esté soportada (por falta de instalación de algún paquete) el script te notificará el paquete faltante y preguntará si deseas instalarlo.</w:t>
+      </w:r>
+    </w:p>
+    <w:p>
+      <w:pPr>
+        <w:pStyle w:val="Prrafodelista"/>
+        <w:numPr>
+          <w:ilvl w:val="0"/>
+          <w:numId w:val="2"/>
+        </w:numPr>
+        <w:rPr>
+          <w:rFonts w:ascii="Arial" w:hAnsi="Arial" w:cs="Arial"/>
+        </w:rPr>
+      </w:pPr>
+      <w:r>
+        <w:rPr>
+          <w:rFonts w:ascii="Arial" w:hAnsi="Arial" w:cs="Arial"/>
+        </w:rPr>
+        <w:t xml:space="preserve">Una vez instalado el </w:t>
+      </w:r>
+      <w:r>
+        <w:rPr>
+          <w:rFonts w:ascii="Arial" w:hAnsi="Arial" w:cs="Arial"/>
+        </w:rPr>
+        <w:t>servicio SSH el script configurará de manera automática en el puerto número 22 y encenderá el ssh de manera automática</w:t>
+      </w:r>
+      <w:r>
+        <w:rPr>
+          <w:rFonts w:ascii="Arial" w:hAnsi="Arial" w:cs="Arial"/>
+        </w:rPr>
+        <w:t>.</w:t>
+      </w:r>
+    </w:p>
+    <w:p>
+      <w:pPr>
+        <w:pStyle w:val="Prrafodelista"/>
+        <w:numPr>
+          <w:ilvl w:val="0"/>
+          <w:numId w:val="2"/>
+        </w:numPr>
+        <w:rPr>
+          <w:rFonts w:ascii="Arial" w:hAnsi="Arial" w:cs="Arial"/>
+        </w:rPr>
+      </w:pPr>
+      <w:r>
+        <w:rPr>
+          <w:rFonts w:ascii="Arial" w:hAnsi="Arial" w:cs="Arial"/>
+        </w:rPr>
+        <w:t>El usuario puede reiniciar e instalar de nuevo para sobrescribir la instalación anterior pero siempre se va a configurar en su puerto por defecto número 22.</w:t>
+      </w:r>
+    </w:p>
+    <w:p>
+      <w:pPr>
+        <w:pStyle w:val="Prrafodelista"/>
+        <w:numPr>
+          <w:ilvl w:val="0"/>
+          <w:numId w:val="2"/>
+        </w:numPr>
+        <w:rPr>
+          <w:rFonts w:ascii="Arial" w:hAnsi="Arial" w:cs="Arial"/>
+        </w:rPr>
+      </w:pPr>
+      <w:r>
+        <w:rPr>
+          <w:rFonts w:ascii="Arial" w:hAnsi="Arial" w:cs="Arial"/>
+        </w:rPr>
+        <w:t xml:space="preserve">Una vez instalado y configurado el servicio ssh, ya estará listo para conectarse de manera remota con un usuario, para eso tendrás que identificar la IP de la tercera interfaz de red configurada para esta práctica (puente) </w:t>
+      </w:r>
+      <w:r>
+        <w:rPr>
+          <w:rFonts w:ascii="Arial" w:hAnsi="Arial" w:cs="Arial"/>
+        </w:rPr>
+        <w:t>y elegir un cliente ssh.</w:t>
+      </w:r>
+    </w:p>
+    <w:p>
+      <w:pPr>
+        <w:pStyle w:val="Prrafodelista"/>
+        <w:numPr>
+          <w:ilvl w:val="0"/>
+          <w:numId w:val="2"/>
+        </w:numPr>
+        <w:rPr>
+          <w:rFonts w:ascii="Arial" w:hAnsi="Arial" w:cs="Arial"/>
+        </w:rPr>
+      </w:pPr>
+      <w:r>
+        <w:rPr>
+          <w:rFonts w:ascii="Arial" w:hAnsi="Arial" w:cs="Arial"/>
+        </w:rPr>
+        <w:t>Para esta práctica se eligió el cliente ssh PuTTY, se ingresa la IP del servidor, se selecciona que será conexión tipo ssh, te pedir ingresar tu usuario y contraseña, una vez ingresado el usuario y contraseña de manera correcta te mostrará la ventana tal cual el servidor.</w:t>
+      </w:r>
+    </w:p>
+    <w:p>
+      <w:pPr>
+        <w:pStyle w:val="Prrafodelista"/>
+        <w:numPr>
+          <w:ilvl w:val="0"/>
+          <w:numId w:val="2"/>
+        </w:numPr>
+        <w:rPr>
+          <w:rFonts w:ascii="Arial" w:hAnsi="Arial" w:cs="Arial"/>
+        </w:rPr>
+      </w:pPr>
+      <w:r>
+        <w:rPr>
+          <w:rFonts w:ascii="Arial" w:hAnsi="Arial" w:cs="Arial"/>
+        </w:rPr>
+        <w:t>Una vez hecho todos los pasos de manera correcta ya estará listo el servidor ssh y el manejo remoto del servidor.</w:t>
+      </w:r>
+    </w:p>
+    <w:p>
+      <w:pPr>
+        <w:rPr>
+          <w:rFonts w:ascii="Arial" w:hAnsi="Arial" w:cs="Arial"/>
+          <w:b/>
+          <w:bCs/>
+          <w:sz w:val="28"/>
+          <w:szCs w:val="28"/>
+        </w:rPr>
+      </w:pPr>
+    </w:p>
+    <w:p>
+      <w:pPr>
+        <w:rPr>
+          <w:rFonts w:ascii="Arial" w:hAnsi="Arial" w:cs="Arial"/>
+          <w:b/>
+          <w:bCs/>
+          <w:sz w:val="28"/>
+          <w:szCs w:val="28"/>
+        </w:rPr>
+      </w:pPr>
+    </w:p>
+    <w:p>
+      <w:pPr>
+        <w:rPr>
+          <w:rFonts w:ascii="Arial" w:hAnsi="Arial" w:cs="Arial"/>
+          <w:b/>
+          <w:bCs/>
+          <w:sz w:val="28"/>
+          <w:szCs w:val="28"/>
+        </w:rPr>
+      </w:pPr>
+    </w:p>
+    <w:p>
+      <w:pPr>
+        <w:rPr>
+          <w:rFonts w:ascii="Arial" w:hAnsi="Arial" w:cs="Arial"/>
+          <w:b/>
+          <w:bCs/>
+          <w:sz w:val="28"/>
+          <w:szCs w:val="28"/>
+        </w:rPr>
+      </w:pPr>
+    </w:p>
+    <w:p>
+      <w:pPr>
+        <w:rPr>
+          <w:rFonts w:ascii="Arial" w:hAnsi="Arial" w:cs="Arial"/>
+          <w:b/>
+          <w:bCs/>
+          <w:sz w:val="28"/>
+          <w:szCs w:val="28"/>
+        </w:rPr>
+      </w:pPr>
+    </w:p>
+    <w:p>
+      <w:pPr>
+        <w:rPr>
+          <w:rFonts w:ascii="Arial" w:hAnsi="Arial" w:cs="Arial"/>
+          <w:b/>
+          <w:bCs/>
+          <w:sz w:val="28"/>
+          <w:szCs w:val="28"/>
+        </w:rPr>
+      </w:pPr>
+    </w:p>
+    <w:p>
+      <w:pPr>
+        <w:rPr>
+          <w:rFonts w:ascii="Arial" w:hAnsi="Arial" w:cs="Arial"/>
+          <w:b/>
+          <w:bCs/>
+          <w:sz w:val="28"/>
+          <w:szCs w:val="28"/>
+        </w:rPr>
+      </w:pPr>
+      <w:r>
+        <w:rPr>
+          <w:rFonts w:ascii="Arial" w:hAnsi="Arial" w:cs="Arial"/>
+          <w:b/>
+          <w:bCs/>
+          <w:sz w:val="28"/>
+          <w:szCs w:val="28"/>
+        </w:rPr>
+        <w:lastRenderedPageBreak/>
+        <w:t xml:space="preserve"> </w:t>
+      </w:r>
+      <w:r>
+        <w:rPr>
+          <w:rFonts w:ascii="Arial" w:hAnsi="Arial" w:cs="Arial"/>
+          <w:b/>
+          <w:bCs/>
+          <w:sz w:val="28"/>
+          <w:szCs w:val="28"/>
+        </w:rPr>
+        <w:t>Bitácora</w:t>
+      </w:r>
+      <w:r>
+        <w:rPr>
+          <w:rFonts w:ascii="Arial" w:hAnsi="Arial" w:cs="Arial"/>
+          <w:b/>
+          <w:bCs/>
+          <w:sz w:val="28"/>
+          <w:szCs w:val="28"/>
+        </w:rPr>
+        <w:t xml:space="preserve"> de desarrollo y configuración</w:t>
+      </w:r>
+    </w:p>
+    <w:p>
+      <w:pPr>
+        <w:rPr>
+          <w:rFonts w:ascii="Arial" w:hAnsi="Arial" w:cs="Arial"/>
+          <w:b/>
+          <w:bCs/>
+        </w:rPr>
+      </w:pPr>
+      <w:r>
+        <w:rPr>
+          <w:rFonts w:ascii="Arial" w:hAnsi="Arial" w:cs="Arial"/>
+          <w:b/>
+          <w:bCs/>
+        </w:rPr>
+        <w:t>Explicación de script:</w:t>
+      </w:r>
+    </w:p>
+    <w:p>
+      <w:pPr>
+        <w:pStyle w:val="Prrafodelista"/>
+        <w:numPr>
+          <w:ilvl w:val="0"/>
+          <w:numId w:val="3"/>
+        </w:numPr>
+        <w:rPr>
+          <w:rFonts w:ascii="Arial" w:hAnsi="Arial" w:cs="Arial"/>
+        </w:rPr>
+      </w:pPr>
+      <w:r>
+        <w:rPr>
+          <w:rFonts w:ascii="Arial" w:hAnsi="Arial" w:cs="Arial"/>
+        </w:rPr>
+        <w:t xml:space="preserve">Si </w:t>
+      </w:r>
+      <w:r>
+        <w:rPr>
+          <w:rFonts w:ascii="Arial" w:hAnsi="Arial" w:cs="Arial"/>
+        </w:rPr>
+        <w:t xml:space="preserve">selecciona la opción de instalar, el script primero buscara si el servicio ssh no se encuentra instalado ya, en caso de ya estar instalado el script </w:t>
+      </w:r>
+      <w:proofErr w:type="gramStart"/>
+      <w:r>
+        <w:rPr>
+          <w:rFonts w:ascii="Arial" w:hAnsi="Arial" w:cs="Arial"/>
+        </w:rPr>
+        <w:t>preguntara</w:t>
+      </w:r>
+      <w:proofErr w:type="gramEnd"/>
+      <w:r>
+        <w:rPr>
+          <w:rFonts w:ascii="Arial" w:hAnsi="Arial" w:cs="Arial"/>
+        </w:rPr>
+        <w:t xml:space="preserve"> si desea reinstalar y reconfigurar, si el usuario accede procederá a reinstalarse y reconfigurarse.</w:t>
+      </w:r>
+    </w:p>
+    <w:p>
+      <w:pPr>
+        <w:pStyle w:val="Prrafodelista"/>
+        <w:numPr>
+          <w:ilvl w:val="0"/>
+          <w:numId w:val="3"/>
+        </w:numPr>
+        <w:rPr>
+          <w:rFonts w:ascii="Arial" w:hAnsi="Arial" w:cs="Arial"/>
+        </w:rPr>
+      </w:pPr>
+      <w:r>
+        <w:rPr>
+          <w:rFonts w:ascii="Arial" w:hAnsi="Arial" w:cs="Arial"/>
+        </w:rPr>
+        <w:t>Si el usuario selecciona la opción de ver el estado del servicio, podrá ver los logs que ha tendido a través del ssh, el tiempo y con que usuario de ingreso.</w:t>
+      </w:r>
+    </w:p>
+    <w:p>
+      <w:pPr>
+        <w:pStyle w:val="Prrafodelista"/>
+        <w:numPr>
+          <w:ilvl w:val="0"/>
+          <w:numId w:val="3"/>
+        </w:numPr>
+        <w:rPr>
+          <w:rFonts w:ascii="Arial" w:hAnsi="Arial" w:cs="Arial"/>
+        </w:rPr>
+      </w:pPr>
+      <w:r>
+        <w:rPr>
+          <w:rFonts w:ascii="Arial" w:hAnsi="Arial" w:cs="Arial"/>
+        </w:rPr>
+        <w:t>La opción reiniciar, simplemente reinicia el servicio ssh, no hace cambios ni reconfigura nada.</w:t>
+      </w:r>
+    </w:p>
+    <w:p>
+      <w:pPr>
+        <w:rPr>
+          <w:rFonts w:ascii="Arial" w:hAnsi="Arial" w:cs="Arial"/>
+          <w:b/>
+          <w:bCs/>
+          <w:sz w:val="28"/>
+          <w:szCs w:val="28"/>
+        </w:rPr>
+      </w:pPr>
+    </w:p>
+    <w:p>
+      <w:pPr>
+        <w:rPr>
+          <w:rFonts w:ascii="Arial" w:hAnsi="Arial" w:cs="Arial"/>
+          <w:b/>
+          <w:bCs/>
+          <w:sz w:val="28"/>
+          <w:szCs w:val="28"/>
+        </w:rPr>
+      </w:pPr>
+      <w:r>
+        <w:rPr>
+          <w:rFonts w:ascii="Arial" w:hAnsi="Arial" w:cs="Arial"/>
+          <w:b/>
+          <w:bCs/>
+          <w:sz w:val="28"/>
+          <w:szCs w:val="28"/>
+        </w:rPr>
+        <w:t>Pruebas de funcionamiento</w:t>
+      </w:r>
+    </w:p>
+    <w:p>
+      <w:pPr>
+        <w:rPr>
+          <w:rFonts w:ascii="Arial" w:hAnsi="Arial" w:cs="Arial"/>
+        </w:rPr>
+      </w:pPr>
+      <w:r>
+        <w:rPr>
+          <w:rFonts w:ascii="Arial" w:hAnsi="Arial" w:cs="Arial"/>
+          <w:b/>
+          <w:bCs/>
+        </w:rPr>
+        <w:t xml:space="preserve">Protocolos de pruebas: </w:t>
+      </w:r>
+    </w:p>
+    <w:p>
+      <w:pPr>
+        <w:rPr>
+          <w:rFonts w:ascii="Arial" w:hAnsi="Arial" w:cs="Arial"/>
+        </w:rPr>
+      </w:pPr>
+      <w:r>
+        <w:rPr>
+          <w:rFonts w:ascii="Arial" w:hAnsi="Arial" w:cs="Arial"/>
+        </w:rPr>
+        <w:t>Linux:</w:t>
+      </w:r>
+    </w:p>
+    <w:p>
+      <w:pPr>
+        <w:rPr>
+          <w:rFonts w:ascii="Arial" w:hAnsi="Arial" w:cs="Arial"/>
+        </w:rPr>
+      </w:pPr>
+      <w:r>
+        <w:rPr>
+          <w:rFonts w:ascii="Arial" w:hAnsi="Arial" w:cs="Arial"/>
+        </w:rPr>
+        <w:tab/>
+        <w:t>Script:</w:t>
+      </w:r>
+    </w:p>
+    <w:p>
+      <w:pPr>
+        <w:rPr>
+          <w:rFonts w:ascii="Arial" w:hAnsi="Arial" w:cs="Arial"/>
+        </w:rPr>
+      </w:pPr>
+      <w:r>
+        <w:rPr>
+          <w:rFonts w:ascii="Arial" w:hAnsi="Arial" w:cs="Arial"/>
+        </w:rPr>
         <w:drawing>
-          <wp:anchor distT="0" distB="0" distL="114300" distR="114300" simplePos="0" relativeHeight="251660288" behindDoc="0" locked="0" layoutInCell="1" allowOverlap="1" wp14:anchorId="264B8326" wp14:editId="74AF589E">
-            <wp:simplePos x="0" y="0"/>
-            <wp:positionH relativeFrom="margin">
-              <wp:posOffset>720090</wp:posOffset>
-            </wp:positionH>
-            <wp:positionV relativeFrom="margin">
-              <wp:posOffset>343535</wp:posOffset>
-            </wp:positionV>
-            <wp:extent cx="4417060" cy="3314700"/>
-            <wp:effectExtent l="0" t="0" r="2540" b="0"/>
-            <wp:wrapSquare wrapText="bothSides"/>
-            <wp:docPr id="192270826" name="Imagen 3"/>
+          <wp:inline distT="0" distB="0" distL="0" distR="0" wp14:anchorId="4CA9782C" wp14:editId="7B7C3513">
+            <wp:extent cx="5612130" cy="3540125"/>
+            <wp:effectExtent l="0" t="0" r="7620" b="3175"/>
+            <wp:docPr id="1301618482" name="Imagen 1" descr="Texto&#10;&#10;El contenido generado por IA puede ser incorrecto."/>
             <wp:cNvGraphicFramePr>
               <a:graphicFrameLocks xmlns:a="http://schemas.openxmlformats.org/drawingml/2006/main" noChangeAspect="1"/>
             </wp:cNvGraphicFramePr>
@@ -1465,47 +1753,28 @@
               <a:graphicData uri="http://schemas.openxmlformats.org/drawingml/2006/picture">
                 <pic:pic xmlns:pic="http://schemas.openxmlformats.org/drawingml/2006/picture">
                   <pic:nvPicPr>
-                    <pic:cNvPr id="0" name="Picture 4"/>
-                    <pic:cNvPicPr>
-                      <a:picLocks noChangeAspect="1" noChangeArrowheads="1"/>
-                    </pic:cNvPicPr>
+                    <pic:cNvPr id="1301618482" name="Imagen 1" descr="Texto&#10;&#10;El contenido generado por IA puede ser incorrecto."/>
+                    <pic:cNvPicPr/>
                   </pic:nvPicPr>
                   <pic:blipFill>
-                    <a:blip r:embed="rId10">
-                      <a:extLst>
-                        <a:ext uri="{28A0092B-C50C-407E-A947-70E740481C1C}">
-                          <a14:useLocalDpi xmlns:a14="http://schemas.microsoft.com/office/drawing/2010/main" val="0"/>
-                        </a:ext>
-                      </a:extLst>
-                    </a:blip>
-                    <a:srcRect/>
+                    <a:blip r:embed="rId10"/>
                     <a:stretch>
                       <a:fillRect/>
                     </a:stretch>
                   </pic:blipFill>
-                  <pic:spPr bwMode="auto">
+                  <pic:spPr>
                     <a:xfrm>
                       <a:off x="0" y="0"/>
-                      <a:ext cx="4417060" cy="3314700"/>
+                      <a:ext cx="5612130" cy="3540125"/>
                     </a:xfrm>
                     <a:prstGeom prst="rect">
                       <a:avLst/>
                     </a:prstGeom>
-                    <a:noFill/>
-                    <a:ln>
-                      <a:noFill/>
-                    </a:ln>
                   </pic:spPr>
                 </pic:pic>
               </a:graphicData>
             </a:graphic>
-            <wp14:sizeRelH relativeFrom="margin">
-              <wp14:pctWidth>0</wp14:pctWidth>
-            </wp14:sizeRelH>
-            <wp14:sizeRelV relativeFrom="margin">
-              <wp14:pctHeight>0</wp14:pctHeight>
-            </wp14:sizeRelV>
-          </wp:anchor>
+          </wp:inline>
         </w:drawing>
       </w:r>
     </w:p>
@@ -1513,628 +1782,22 @@
       <w:pPr>
         <w:rPr>
           <w:rFonts w:ascii="Arial" w:hAnsi="Arial" w:cs="Arial"/>
-          <w:sz w:val="28"/>
-          <w:szCs w:val="28"/>
-        </w:rPr>
-      </w:pPr>
-    </w:p>
-    <w:p>
-      <w:pPr>
-        <w:rPr>
-          <w:rFonts w:ascii="Arial" w:hAnsi="Arial" w:cs="Arial"/>
-          <w:sz w:val="28"/>
-          <w:szCs w:val="28"/>
-        </w:rPr>
-      </w:pPr>
-    </w:p>
-    <w:p>
-      <w:pPr>
-        <w:rPr>
-          <w:rFonts w:ascii="Arial" w:hAnsi="Arial" w:cs="Arial"/>
-          <w:sz w:val="28"/>
-          <w:szCs w:val="28"/>
-        </w:rPr>
-      </w:pPr>
-    </w:p>
-    <w:p>
-      <w:pPr>
-        <w:rPr>
-          <w:rFonts w:ascii="Arial" w:hAnsi="Arial" w:cs="Arial"/>
-          <w:sz w:val="28"/>
-          <w:szCs w:val="28"/>
-        </w:rPr>
-      </w:pPr>
-    </w:p>
-    <w:p>
-      <w:pPr>
-        <w:rPr>
-          <w:rFonts w:ascii="Arial" w:hAnsi="Arial" w:cs="Arial"/>
-          <w:sz w:val="28"/>
-          <w:szCs w:val="28"/>
-        </w:rPr>
-      </w:pPr>
-    </w:p>
-    <w:p>
-      <w:pPr>
-        <w:rPr>
-          <w:rFonts w:ascii="Arial" w:hAnsi="Arial" w:cs="Arial"/>
-          <w:sz w:val="28"/>
-          <w:szCs w:val="28"/>
-        </w:rPr>
-      </w:pPr>
-    </w:p>
-    <w:p>
-      <w:pPr>
-        <w:rPr>
-          <w:rFonts w:ascii="Arial" w:hAnsi="Arial" w:cs="Arial"/>
-          <w:sz w:val="28"/>
-          <w:szCs w:val="28"/>
-        </w:rPr>
-      </w:pPr>
-    </w:p>
-    <w:p>
-      <w:pPr>
-        <w:rPr>
-          <w:rFonts w:ascii="Arial" w:hAnsi="Arial" w:cs="Arial"/>
-          <w:sz w:val="28"/>
-          <w:szCs w:val="28"/>
-        </w:rPr>
-      </w:pPr>
-    </w:p>
-    <w:p>
-      <w:pPr>
-        <w:rPr>
-          <w:rFonts w:ascii="Arial" w:hAnsi="Arial" w:cs="Arial"/>
-          <w:sz w:val="28"/>
-          <w:szCs w:val="28"/>
-        </w:rPr>
-      </w:pPr>
-    </w:p>
-    <w:p>
-      <w:pPr>
-        <w:rPr>
-          <w:rFonts w:ascii="Arial" w:hAnsi="Arial" w:cs="Arial"/>
-          <w:b/>
-          <w:bCs/>
-          <w:sz w:val="32"/>
-          <w:szCs w:val="32"/>
-        </w:rPr>
-      </w:pPr>
-      <w:r>
-        <w:rPr>
-          <w:rFonts w:ascii="Arial" w:hAnsi="Arial" w:cs="Arial"/>
-          <w:b/>
-          <w:bCs/>
-          <w:sz w:val="32"/>
-          <w:szCs w:val="32"/>
-        </w:rPr>
-        <w:t>Guia de uso de Scripts</w:t>
-      </w:r>
-    </w:p>
-    <w:p>
-      <w:pPr>
-        <w:rPr>
-          <w:rFonts w:ascii="Arial" w:hAnsi="Arial" w:cs="Arial"/>
-        </w:rPr>
-      </w:pPr>
-      <w:r>
-        <w:rPr>
-          <w:rFonts w:ascii="Arial" w:hAnsi="Arial" w:cs="Arial"/>
-          <w:b/>
-          <w:bCs/>
-        </w:rPr>
-        <w:t>Requisitos Previos</w:t>
-      </w:r>
-      <w:r>
-        <w:rPr>
-          <w:rFonts w:ascii="Arial" w:hAnsi="Arial" w:cs="Arial"/>
-          <w:b/>
-          <w:bCs/>
-        </w:rPr>
-        <w:t xml:space="preserve">: </w:t>
-      </w:r>
-      <w:r>
-        <w:rPr>
-          <w:rFonts w:ascii="Arial" w:hAnsi="Arial" w:cs="Arial"/>
-        </w:rPr>
-        <w:t>Se deberá ejecutar el script como administrador.</w:t>
-      </w:r>
-    </w:p>
-    <w:p>
-      <w:pPr>
-        <w:rPr>
-          <w:rFonts w:ascii="Arial" w:hAnsi="Arial" w:cs="Arial"/>
-        </w:rPr>
-      </w:pPr>
-      <w:r>
-        <w:rPr>
-          <w:rFonts w:ascii="Arial" w:hAnsi="Arial" w:cs="Arial"/>
-          <w:b/>
-          <w:bCs/>
-        </w:rPr>
-        <w:t>Instrucciones de ejecución:</w:t>
-      </w:r>
-      <w:r>
-        <w:rPr>
-          <w:rFonts w:ascii="Arial" w:hAnsi="Arial" w:cs="Arial"/>
-          <w:b/>
-          <w:bCs/>
-        </w:rPr>
-        <w:t xml:space="preserve"> </w:t>
-      </w:r>
-    </w:p>
-    <w:p>
-      <w:pPr>
-        <w:rPr>
-          <w:rFonts w:ascii="Arial" w:hAnsi="Arial" w:cs="Arial"/>
-        </w:rPr>
-      </w:pPr>
-      <w:r>
-        <w:rPr>
-          <w:rFonts w:ascii="Arial" w:hAnsi="Arial" w:cs="Arial"/>
-        </w:rPr>
-        <w:t xml:space="preserve">Comando exacto en Linux: sh </w:t>
-      </w:r>
-      <w:r>
-        <w:rPr>
-          <w:rFonts w:ascii="Arial" w:hAnsi="Arial" w:cs="Arial"/>
-        </w:rPr>
-        <w:t>entregable1_instalacion.sh</w:t>
-      </w:r>
-    </w:p>
-    <w:p>
-      <w:pPr>
-        <w:rPr>
-          <w:rFonts w:ascii="Arial" w:hAnsi="Arial" w:cs="Arial"/>
-        </w:rPr>
-      </w:pPr>
-      <w:r>
-        <w:rPr>
-          <w:rFonts w:ascii="Arial" w:hAnsi="Arial" w:cs="Arial"/>
-        </w:rPr>
-        <w:t>Comando exacto en Windows: .\</w:t>
-      </w:r>
-      <w:r>
-        <w:rPr>
-          <w:rFonts w:ascii="Arial" w:hAnsi="Arial" w:cs="Arial"/>
-        </w:rPr>
-        <w:t>entregable1_windows.ps1</w:t>
-      </w:r>
-    </w:p>
-    <w:p>
-      <w:pPr>
-        <w:rPr>
-          <w:rFonts w:ascii="Arial" w:hAnsi="Arial" w:cs="Arial"/>
-          <w:b/>
-          <w:bCs/>
-        </w:rPr>
-      </w:pPr>
-      <w:r>
-        <w:rPr>
-          <w:rFonts w:ascii="Arial" w:hAnsi="Arial" w:cs="Arial"/>
-          <w:b/>
-          <w:bCs/>
-        </w:rPr>
-        <w:t xml:space="preserve">Flujo de </w:t>
-      </w:r>
-      <w:r>
-        <w:rPr>
-          <w:rFonts w:ascii="Arial" w:hAnsi="Arial" w:cs="Arial"/>
-          <w:b/>
-          <w:bCs/>
-        </w:rPr>
-        <w:t>interacción</w:t>
-      </w:r>
-      <w:r>
-        <w:rPr>
-          <w:rFonts w:ascii="Arial" w:hAnsi="Arial" w:cs="Arial"/>
-          <w:b/>
-          <w:bCs/>
-        </w:rPr>
-        <w:t>:</w:t>
-      </w:r>
-    </w:p>
-    <w:p>
-      <w:pPr>
-        <w:pStyle w:val="Prrafodelista"/>
-        <w:numPr>
-          <w:ilvl w:val="0"/>
-          <w:numId w:val="2"/>
-        </w:numPr>
-        <w:rPr>
-          <w:rFonts w:ascii="Arial" w:hAnsi="Arial" w:cs="Arial"/>
-        </w:rPr>
-      </w:pPr>
-      <w:r>
-        <w:rPr>
-          <w:rFonts w:ascii="Arial" w:hAnsi="Arial" w:cs="Arial"/>
-        </w:rPr>
-        <w:t>El script mostrara un menú con opciones disponibles.</w:t>
-      </w:r>
-    </w:p>
-    <w:p>
-      <w:pPr>
-        <w:pStyle w:val="Prrafodelista"/>
-        <w:numPr>
-          <w:ilvl w:val="0"/>
-          <w:numId w:val="2"/>
-        </w:numPr>
-        <w:rPr>
-          <w:rFonts w:ascii="Arial" w:hAnsi="Arial" w:cs="Arial"/>
-        </w:rPr>
-      </w:pPr>
-      <w:r>
-        <w:rPr>
-          <w:rFonts w:ascii="Arial" w:hAnsi="Arial" w:cs="Arial"/>
-        </w:rPr>
-        <w:t xml:space="preserve">El usuario deberá elegir una opción, en caso de elegir una </w:t>
-      </w:r>
-      <w:proofErr w:type="spellStart"/>
-      <w:r>
-        <w:rPr>
-          <w:rFonts w:ascii="Arial" w:hAnsi="Arial" w:cs="Arial"/>
-        </w:rPr>
-        <w:t>opcion</w:t>
-      </w:r>
-      <w:proofErr w:type="spellEnd"/>
-      <w:r>
-        <w:rPr>
-          <w:rFonts w:ascii="Arial" w:hAnsi="Arial" w:cs="Arial"/>
-        </w:rPr>
-        <w:t xml:space="preserve"> que no esté soportada (por falta de instalación de algún paquete) el script te notificará el paquete faltante y preguntará si deseas instalarlo.</w:t>
-      </w:r>
-    </w:p>
-    <w:p>
-      <w:pPr>
-        <w:pStyle w:val="Prrafodelista"/>
-        <w:numPr>
-          <w:ilvl w:val="0"/>
-          <w:numId w:val="2"/>
-        </w:numPr>
-        <w:rPr>
-          <w:rFonts w:ascii="Arial" w:hAnsi="Arial" w:cs="Arial"/>
-        </w:rPr>
-      </w:pPr>
-      <w:r>
-        <w:rPr>
-          <w:rFonts w:ascii="Arial" w:hAnsi="Arial" w:cs="Arial"/>
-        </w:rPr>
-        <w:t>Una vez instalado el paquete DHCP te pedirá configuración, aquí es donde ingresara el rango de IP (inicial, final), seguido del Gateway y DNS primario y secundario.</w:t>
-      </w:r>
-    </w:p>
-    <w:p>
-      <w:pPr>
-        <w:pStyle w:val="Prrafodelista"/>
-        <w:numPr>
-          <w:ilvl w:val="0"/>
-          <w:numId w:val="2"/>
-        </w:numPr>
-        <w:rPr>
-          <w:rFonts w:ascii="Arial" w:hAnsi="Arial" w:cs="Arial"/>
-        </w:rPr>
-      </w:pPr>
-      <w:r>
-        <w:rPr>
-          <w:rFonts w:ascii="Arial" w:hAnsi="Arial" w:cs="Arial"/>
-        </w:rPr>
-        <w:t>El script le asignara de manera automática la primera IP del rango ingresado al servidor y le sumara 1 al rango inicial del DHCP y se levantara automáticamente para empezar a asignar IPs a los clientes</w:t>
-      </w:r>
-    </w:p>
-    <w:p>
-      <w:pPr>
-        <w:pStyle w:val="Prrafodelista"/>
-        <w:numPr>
-          <w:ilvl w:val="0"/>
-          <w:numId w:val="2"/>
-        </w:numPr>
-        <w:rPr>
-          <w:rFonts w:ascii="Arial" w:hAnsi="Arial" w:cs="Arial"/>
-        </w:rPr>
-      </w:pPr>
-      <w:r>
-        <w:rPr>
-          <w:rFonts w:ascii="Arial" w:hAnsi="Arial" w:cs="Arial"/>
-        </w:rPr>
-        <w:t>Seguido te regresara al menú de manera automática donde podrás detener el servidor o monitorear el servidor para poder ver la configuración ingresada, IPs asignadas y últimos logs.</w:t>
-      </w:r>
-    </w:p>
-    <w:p>
-      <w:pPr>
-        <w:rPr>
-          <w:rFonts w:ascii="Arial" w:hAnsi="Arial" w:cs="Arial"/>
-          <w:b/>
-          <w:bCs/>
-          <w:sz w:val="28"/>
-          <w:szCs w:val="28"/>
-        </w:rPr>
-      </w:pPr>
-      <w:r>
-        <w:rPr>
-          <w:rFonts w:ascii="Arial" w:hAnsi="Arial" w:cs="Arial"/>
-          <w:b/>
-          <w:bCs/>
-          <w:sz w:val="28"/>
-          <w:szCs w:val="28"/>
+        </w:rPr>
+      </w:pPr>
+    </w:p>
+    <w:p>
+      <w:pPr>
+        <w:rPr>
+          <w:rFonts w:ascii="Arial" w:hAnsi="Arial" w:cs="Arial"/>
+        </w:rPr>
+      </w:pPr>
+      <w:r>
+        <w:rPr>
+          <w:rFonts w:ascii="Arial" w:hAnsi="Arial" w:cs="Arial"/>
         </w:rPr>
         <w:lastRenderedPageBreak/>
-        <w:t>Bitácora</w:t>
-      </w:r>
-      <w:r>
-        <w:rPr>
-          <w:rFonts w:ascii="Arial" w:hAnsi="Arial" w:cs="Arial"/>
-          <w:b/>
-          <w:bCs/>
-          <w:sz w:val="28"/>
-          <w:szCs w:val="28"/>
-        </w:rPr>
-        <w:t xml:space="preserve"> de desarrollo y configuración</w:t>
-      </w:r>
-    </w:p>
-    <w:p>
-      <w:pPr>
-        <w:rPr>
-          <w:rFonts w:ascii="Arial" w:hAnsi="Arial" w:cs="Arial"/>
-          <w:b/>
-          <w:bCs/>
-        </w:rPr>
-      </w:pPr>
-      <w:r>
-        <w:rPr>
-          <w:rFonts w:ascii="Arial" w:hAnsi="Arial" w:cs="Arial"/>
-          <w:b/>
-          <w:bCs/>
-        </w:rPr>
-        <w:t>Explicación de script:</w:t>
-      </w:r>
-    </w:p>
-    <w:p>
-      <w:pPr>
-        <w:pStyle w:val="Prrafodelista"/>
-        <w:numPr>
-          <w:ilvl w:val="0"/>
-          <w:numId w:val="3"/>
-        </w:numPr>
-        <w:rPr>
-          <w:rFonts w:ascii="Arial" w:hAnsi="Arial" w:cs="Arial"/>
-        </w:rPr>
-      </w:pPr>
-      <w:r>
-        <w:rPr>
-          <w:rFonts w:ascii="Arial" w:hAnsi="Arial" w:cs="Arial"/>
-        </w:rPr>
-        <w:t>Si el usuario selecciona la opción de verificar, el script dará un escaneo de paquetes instalado y validará si se encuentra o no instalado el paquete solicitado, en caso de que no este instalado, el servidor dará un mensaje de que el script no está instalado.</w:t>
-      </w:r>
-    </w:p>
-    <w:p>
-      <w:pPr>
-        <w:pStyle w:val="Prrafodelista"/>
-        <w:numPr>
-          <w:ilvl w:val="0"/>
-          <w:numId w:val="3"/>
-        </w:numPr>
-        <w:rPr>
-          <w:rFonts w:ascii="Arial" w:hAnsi="Arial" w:cs="Arial"/>
-        </w:rPr>
-      </w:pPr>
-      <w:r>
-        <w:rPr>
-          <w:rFonts w:ascii="Arial" w:hAnsi="Arial" w:cs="Arial"/>
-        </w:rPr>
-        <w:t>En caso de seleccionar la opción de instalación, el script primero volverá a dar un escaneo a los paquetes instalados para verificar que si este instalado el paquete que se va a utilizar, en caso de que no esté instalado procederá a dar una instalación silenciosa del paquete y luego pasara por la configuración DHCP, donde primero preguntara pro el nombre del ámbito, seguido de IP inicial, IP final, Gateway, DNS primario y secundario.</w:t>
-      </w:r>
-    </w:p>
-    <w:p>
-      <w:pPr>
-        <w:pStyle w:val="Prrafodelista"/>
-        <w:numPr>
-          <w:ilvl w:val="0"/>
-          <w:numId w:val="3"/>
-        </w:numPr>
-        <w:rPr>
-          <w:rFonts w:ascii="Arial" w:hAnsi="Arial" w:cs="Arial"/>
-        </w:rPr>
-      </w:pPr>
-      <w:r>
-        <w:rPr>
-          <w:rFonts w:ascii="Arial" w:hAnsi="Arial" w:cs="Arial"/>
-        </w:rPr>
-        <w:t>El script validara cada IP proporcionada, verificara que sean 4 octetos, no tenga cero a la izquierda o que el primer octeto no sea 0, en caso de violar una de esta validación marcara error y volverá a pedir de nuevo la IP, de esta manera pasara hasta que se ingrese una IP valida.</w:t>
-      </w:r>
-    </w:p>
-    <w:p>
-      <w:pPr>
-        <w:pStyle w:val="Prrafodelista"/>
-        <w:numPr>
-          <w:ilvl w:val="0"/>
-          <w:numId w:val="3"/>
-        </w:numPr>
-        <w:rPr>
-          <w:rFonts w:ascii="Arial" w:hAnsi="Arial" w:cs="Arial"/>
-        </w:rPr>
-      </w:pPr>
-      <w:r>
-        <w:rPr>
-          <w:rFonts w:ascii="Arial" w:hAnsi="Arial" w:cs="Arial"/>
-        </w:rPr>
-        <w:t>Una vez configurado y levantado el servidor DHCP se podrá ingresar al menú y apagar el servicio DHCP y también se podrá monitorear las IPs asignadas.</w:t>
-      </w:r>
-    </w:p>
-    <w:p>
-      <w:pPr>
-        <w:rPr>
-          <w:rFonts w:ascii="Arial" w:hAnsi="Arial" w:cs="Arial"/>
-        </w:rPr>
-      </w:pPr>
-    </w:p>
-    <w:p>
-      <w:pPr>
-        <w:rPr>
-          <w:rFonts w:ascii="Arial" w:hAnsi="Arial" w:cs="Arial"/>
-          <w:b/>
-          <w:bCs/>
-          <w:sz w:val="28"/>
-          <w:szCs w:val="28"/>
-        </w:rPr>
-      </w:pPr>
-    </w:p>
-    <w:p>
-      <w:pPr>
-        <w:rPr>
-          <w:rFonts w:ascii="Arial" w:hAnsi="Arial" w:cs="Arial"/>
-          <w:b/>
-          <w:bCs/>
-          <w:sz w:val="28"/>
-          <w:szCs w:val="28"/>
-        </w:rPr>
-      </w:pPr>
-    </w:p>
-    <w:p>
-      <w:pPr>
-        <w:rPr>
-          <w:rFonts w:ascii="Arial" w:hAnsi="Arial" w:cs="Arial"/>
-          <w:b/>
-          <w:bCs/>
-          <w:sz w:val="28"/>
-          <w:szCs w:val="28"/>
-        </w:rPr>
-      </w:pPr>
-    </w:p>
-    <w:p>
-      <w:pPr>
-        <w:rPr>
-          <w:rFonts w:ascii="Arial" w:hAnsi="Arial" w:cs="Arial"/>
-          <w:b/>
-          <w:bCs/>
-          <w:sz w:val="28"/>
-          <w:szCs w:val="28"/>
-        </w:rPr>
-      </w:pPr>
-    </w:p>
-    <w:p>
-      <w:pPr>
-        <w:rPr>
-          <w:rFonts w:ascii="Arial" w:hAnsi="Arial" w:cs="Arial"/>
-          <w:b/>
-          <w:bCs/>
-          <w:sz w:val="28"/>
-          <w:szCs w:val="28"/>
-        </w:rPr>
-      </w:pPr>
-    </w:p>
-    <w:p>
-      <w:pPr>
-        <w:rPr>
-          <w:rFonts w:ascii="Arial" w:hAnsi="Arial" w:cs="Arial"/>
-          <w:b/>
-          <w:bCs/>
-          <w:sz w:val="28"/>
-          <w:szCs w:val="28"/>
-        </w:rPr>
-      </w:pPr>
-    </w:p>
-    <w:p>
-      <w:pPr>
-        <w:rPr>
-          <w:rFonts w:ascii="Arial" w:hAnsi="Arial" w:cs="Arial"/>
-          <w:b/>
-          <w:bCs/>
-          <w:sz w:val="28"/>
-          <w:szCs w:val="28"/>
-        </w:rPr>
-      </w:pPr>
-    </w:p>
-    <w:p>
-      <w:pPr>
-        <w:rPr>
-          <w:rFonts w:ascii="Arial" w:hAnsi="Arial" w:cs="Arial"/>
-          <w:b/>
-          <w:bCs/>
-          <w:sz w:val="28"/>
-          <w:szCs w:val="28"/>
-        </w:rPr>
-      </w:pPr>
-    </w:p>
-    <w:p>
-      <w:pPr>
-        <w:rPr>
-          <w:rFonts w:ascii="Arial" w:hAnsi="Arial" w:cs="Arial"/>
-          <w:b/>
-          <w:bCs/>
-          <w:sz w:val="28"/>
-          <w:szCs w:val="28"/>
-        </w:rPr>
-      </w:pPr>
-    </w:p>
-    <w:p>
-      <w:pPr>
-        <w:rPr>
-          <w:rFonts w:ascii="Arial" w:hAnsi="Arial" w:cs="Arial"/>
-          <w:b/>
-          <w:bCs/>
-          <w:sz w:val="28"/>
-          <w:szCs w:val="28"/>
-        </w:rPr>
-      </w:pPr>
-    </w:p>
-    <w:p>
-      <w:pPr>
-        <w:rPr>
-          <w:rFonts w:ascii="Arial" w:hAnsi="Arial" w:cs="Arial"/>
-          <w:b/>
-          <w:bCs/>
-          <w:sz w:val="28"/>
-          <w:szCs w:val="28"/>
-        </w:rPr>
-      </w:pPr>
-    </w:p>
-    <w:p>
-      <w:pPr>
-        <w:rPr>
-          <w:rFonts w:ascii="Arial" w:hAnsi="Arial" w:cs="Arial"/>
-          <w:b/>
-          <w:bCs/>
-          <w:sz w:val="28"/>
-          <w:szCs w:val="28"/>
-        </w:rPr>
-      </w:pPr>
-      <w:r>
-        <w:rPr>
-          <w:rFonts w:ascii="Arial" w:hAnsi="Arial" w:cs="Arial"/>
-          <w:b/>
-          <w:bCs/>
-          <w:sz w:val="28"/>
-          <w:szCs w:val="28"/>
-        </w:rPr>
-        <w:lastRenderedPageBreak/>
-        <w:t>Pruebas de funcionamiento</w:t>
-      </w:r>
-    </w:p>
-    <w:p>
-      <w:pPr>
-        <w:rPr>
-          <w:rFonts w:ascii="Arial" w:hAnsi="Arial" w:cs="Arial"/>
-        </w:rPr>
-      </w:pPr>
-      <w:r>
-        <w:rPr>
-          <w:rFonts w:ascii="Arial" w:hAnsi="Arial" w:cs="Arial"/>
-          <w:b/>
-          <w:bCs/>
-        </w:rPr>
-        <w:t xml:space="preserve">Protocolos de pruebas: </w:t>
-      </w:r>
-    </w:p>
-    <w:p>
-      <w:pPr>
-        <w:rPr>
-          <w:rFonts w:ascii="Arial" w:hAnsi="Arial" w:cs="Arial"/>
-        </w:rPr>
-      </w:pPr>
-      <w:r>
-        <w:rPr>
-          <w:rFonts w:ascii="Arial" w:hAnsi="Arial" w:cs="Arial"/>
-        </w:rPr>
-        <w:t>Linux:</w:t>
+        <w:tab/>
+        <w:t>Prueba de verificación e instalación:</w:t>
       </w:r>
     </w:p>
     <w:p>
@@ -2148,10 +1811,10 @@
           <w:rFonts w:ascii="Arial" w:hAnsi="Arial" w:cs="Arial"/>
         </w:rPr>
         <w:drawing>
-          <wp:inline distT="0" distB="0" distL="0" distR="0" wp14:anchorId="0EE8BCC8" wp14:editId="09230406">
-            <wp:extent cx="5612130" cy="3527425"/>
+          <wp:inline distT="0" distB="0" distL="0" distR="0" wp14:anchorId="3511F529" wp14:editId="2981D1D1">
+            <wp:extent cx="5612130" cy="3543300"/>
             <wp:effectExtent l="0" t="0" r="7620" b="0"/>
-            <wp:docPr id="1950128469" name="Imagen 1" descr="Texto&#10;&#10;El contenido generado por IA puede ser incorrecto."/>
+            <wp:docPr id="236727831" name="Imagen 1" descr="Texto&#10;&#10;El contenido generado por IA puede ser incorrecto."/>
             <wp:cNvGraphicFramePr>
               <a:graphicFrameLocks xmlns:a="http://schemas.openxmlformats.org/drawingml/2006/main" noChangeAspect="1"/>
             </wp:cNvGraphicFramePr>
@@ -2159,7 +1822,7 @@
               <a:graphicData uri="http://schemas.openxmlformats.org/drawingml/2006/picture">
                 <pic:pic xmlns:pic="http://schemas.openxmlformats.org/drawingml/2006/picture">
                   <pic:nvPicPr>
-                    <pic:cNvPr id="1950128469" name="Imagen 1" descr="Texto&#10;&#10;El contenido generado por IA puede ser incorrecto."/>
+                    <pic:cNvPr id="236727831" name="Imagen 1" descr="Texto&#10;&#10;El contenido generado por IA puede ser incorrecto."/>
                     <pic:cNvPicPr/>
                   </pic:nvPicPr>
                   <pic:blipFill>
@@ -2171,7 +1834,7 @@
                   <pic:spPr>
                     <a:xfrm>
                       <a:off x="0" y="0"/>
-                      <a:ext cx="5612130" cy="3527425"/>
+                      <a:ext cx="5612130" cy="3543300"/>
                     </a:xfrm>
                     <a:prstGeom prst="rect">
                       <a:avLst/>
@@ -2194,7 +1857,131 @@
         <w:rPr>
           <w:rFonts w:ascii="Arial" w:hAnsi="Arial" w:cs="Arial"/>
         </w:rPr>
-        <w:t>Opción 1:</w:t>
+        <w:tab/>
+        <w:t xml:space="preserve">PD: La IP del servidor que muestra el script es la IP de la interfaz 2, esta IP puede cambiar según se configure el DHCP, pero también se puede conectar desde la IP de la interfaz numero 3, que esta cambiara según cambie tu conexión con tu </w:t>
+      </w:r>
+      <w:proofErr w:type="gramStart"/>
+      <w:r>
+        <w:rPr>
+          <w:rFonts w:ascii="Arial" w:hAnsi="Arial" w:cs="Arial"/>
+        </w:rPr>
+        <w:t>modem</w:t>
+      </w:r>
+      <w:proofErr w:type="gramEnd"/>
+      <w:r>
+        <w:rPr>
+          <w:rFonts w:ascii="Arial" w:hAnsi="Arial" w:cs="Arial"/>
+        </w:rPr>
+        <w:t xml:space="preserve"> pero no por configuración en el servidor.</w:t>
+      </w:r>
+    </w:p>
+    <w:p>
+      <w:pPr>
+        <w:ind w:firstLine="708"/>
+        <w:rPr>
+          <w:rFonts w:ascii="Arial" w:hAnsi="Arial" w:cs="Arial"/>
+        </w:rPr>
+      </w:pPr>
+    </w:p>
+    <w:p>
+      <w:pPr>
+        <w:ind w:firstLine="708"/>
+        <w:rPr>
+          <w:rFonts w:ascii="Arial" w:hAnsi="Arial" w:cs="Arial"/>
+        </w:rPr>
+      </w:pPr>
+    </w:p>
+    <w:p>
+      <w:pPr>
+        <w:ind w:firstLine="708"/>
+        <w:rPr>
+          <w:rFonts w:ascii="Arial" w:hAnsi="Arial" w:cs="Arial"/>
+        </w:rPr>
+      </w:pPr>
+    </w:p>
+    <w:p>
+      <w:pPr>
+        <w:ind w:firstLine="708"/>
+        <w:rPr>
+          <w:rFonts w:ascii="Arial" w:hAnsi="Arial" w:cs="Arial"/>
+        </w:rPr>
+      </w:pPr>
+    </w:p>
+    <w:p>
+      <w:pPr>
+        <w:ind w:firstLine="708"/>
+        <w:rPr>
+          <w:rFonts w:ascii="Arial" w:hAnsi="Arial" w:cs="Arial"/>
+        </w:rPr>
+      </w:pPr>
+    </w:p>
+    <w:p>
+      <w:pPr>
+        <w:ind w:firstLine="708"/>
+        <w:rPr>
+          <w:rFonts w:ascii="Arial" w:hAnsi="Arial" w:cs="Arial"/>
+        </w:rPr>
+      </w:pPr>
+    </w:p>
+    <w:p>
+      <w:pPr>
+        <w:ind w:firstLine="708"/>
+        <w:rPr>
+          <w:rFonts w:ascii="Arial" w:hAnsi="Arial" w:cs="Arial"/>
+        </w:rPr>
+      </w:pPr>
+    </w:p>
+    <w:p>
+      <w:pPr>
+        <w:ind w:firstLine="708"/>
+        <w:rPr>
+          <w:rFonts w:ascii="Arial" w:hAnsi="Arial" w:cs="Arial"/>
+        </w:rPr>
+      </w:pPr>
+    </w:p>
+    <w:p>
+      <w:pPr>
+        <w:ind w:firstLine="708"/>
+        <w:rPr>
+          <w:rFonts w:ascii="Arial" w:hAnsi="Arial" w:cs="Arial"/>
+        </w:rPr>
+      </w:pPr>
+    </w:p>
+    <w:p>
+      <w:pPr>
+        <w:ind w:firstLine="708"/>
+        <w:rPr>
+          <w:rFonts w:ascii="Arial" w:hAnsi="Arial" w:cs="Arial"/>
+        </w:rPr>
+      </w:pPr>
+    </w:p>
+    <w:p>
+      <w:pPr>
+        <w:ind w:firstLine="708"/>
+        <w:rPr>
+          <w:rFonts w:ascii="Arial" w:hAnsi="Arial" w:cs="Arial"/>
+        </w:rPr>
+      </w:pPr>
+    </w:p>
+    <w:p>
+      <w:pPr>
+        <w:ind w:firstLine="708"/>
+        <w:rPr>
+          <w:rFonts w:ascii="Arial" w:hAnsi="Arial" w:cs="Arial"/>
+        </w:rPr>
+      </w:pPr>
+      <w:r>
+        <w:rPr>
+          <w:rFonts w:ascii="Arial" w:hAnsi="Arial" w:cs="Arial"/>
+        </w:rPr>
+        <w:lastRenderedPageBreak/>
+        <w:t>Ingreso al servidor de manera remota desde PuTTY</w:t>
+      </w:r>
+      <w:r>
+        <w:rPr>
+          <w:rFonts w:ascii="Arial" w:hAnsi="Arial" w:cs="Arial"/>
+        </w:rPr>
+        <w:t>:</w:t>
       </w:r>
     </w:p>
     <w:p>
@@ -2208,10 +1995,10 @@
           <w:rFonts w:ascii="Arial" w:hAnsi="Arial" w:cs="Arial"/>
         </w:rPr>
         <w:drawing>
-          <wp:inline distT="0" distB="0" distL="0" distR="0" wp14:anchorId="142D1C74" wp14:editId="21A9577F">
-            <wp:extent cx="4096322" cy="2505425"/>
-            <wp:effectExtent l="0" t="0" r="0" b="9525"/>
-            <wp:docPr id="1637799228" name="Imagen 1"/>
+          <wp:inline distT="0" distB="0" distL="0" distR="0" wp14:anchorId="62ACB59C" wp14:editId="1E701926">
+            <wp:extent cx="5429250" cy="3405108"/>
+            <wp:effectExtent l="0" t="0" r="0" b="5080"/>
+            <wp:docPr id="287779988" name="Imagen 1" descr="Interfaz de usuario gráfica, Texto&#10;&#10;El contenido generado por IA puede ser incorrecto."/>
             <wp:cNvGraphicFramePr>
               <a:graphicFrameLocks xmlns:a="http://schemas.openxmlformats.org/drawingml/2006/main" noChangeAspect="1"/>
             </wp:cNvGraphicFramePr>
@@ -2219,7 +2006,7 @@
               <a:graphicData uri="http://schemas.openxmlformats.org/drawingml/2006/picture">
                 <pic:pic xmlns:pic="http://schemas.openxmlformats.org/drawingml/2006/picture">
                   <pic:nvPicPr>
-                    <pic:cNvPr id="1637799228" name=""/>
+                    <pic:cNvPr id="287779988" name="Imagen 1" descr="Interfaz de usuario gráfica, Texto&#10;&#10;El contenido generado por IA puede ser incorrecto."/>
                     <pic:cNvPicPr/>
                   </pic:nvPicPr>
                   <pic:blipFill>
@@ -2231,7 +2018,7 @@
                   <pic:spPr>
                     <a:xfrm>
                       <a:off x="0" y="0"/>
-                      <a:ext cx="4096322" cy="2505425"/>
+                      <a:ext cx="5447799" cy="3416742"/>
                     </a:xfrm>
                     <a:prstGeom prst="rect">
                       <a:avLst/>
@@ -2250,38 +2037,26 @@
           <w:rFonts w:ascii="Arial" w:hAnsi="Arial" w:cs="Arial"/>
         </w:rPr>
       </w:pPr>
-    </w:p>
-    <w:p>
-      <w:pPr>
-        <w:rPr>
-          <w:rFonts w:ascii="Arial" w:hAnsi="Arial" w:cs="Arial"/>
-        </w:rPr>
-      </w:pPr>
-    </w:p>
-    <w:p>
-      <w:pPr>
-        <w:rPr>
-          <w:rFonts w:ascii="Arial" w:hAnsi="Arial" w:cs="Arial"/>
-        </w:rPr>
-      </w:pPr>
-      <w:r>
-        <w:rPr>
-          <w:rFonts w:ascii="Arial" w:hAnsi="Arial" w:cs="Arial"/>
-        </w:rPr>
-        <w:lastRenderedPageBreak/>
-        <w:t xml:space="preserve">Opción </w:t>
-      </w:r>
-      <w:r>
-        <w:rPr>
-          <w:rFonts w:ascii="Arial" w:hAnsi="Arial" w:cs="Arial"/>
-        </w:rPr>
-        <w:t>2</w:t>
-      </w:r>
-      <w:r>
-        <w:rPr>
-          <w:rFonts w:ascii="Arial" w:hAnsi="Arial" w:cs="Arial"/>
-        </w:rPr>
-        <w:t>:</w:t>
+      <w:r>
+        <w:rPr>
+          <w:rFonts w:ascii="Arial" w:hAnsi="Arial" w:cs="Arial"/>
+        </w:rPr>
+        <w:tab/>
+        <w:t>PD: Aquí estamos eligiendo la IP de la interfaz de red enp0s9 para conexión en PuTTY, esta IP es la que esta en el mismo segmento que nuestra maquina host.</w:t>
+      </w:r>
+    </w:p>
+    <w:p>
+      <w:pPr>
+        <w:rPr>
+          <w:rFonts w:ascii="Arial" w:hAnsi="Arial" w:cs="Arial"/>
+        </w:rPr>
+      </w:pPr>
+      <w:r>
+        <w:rPr>
+          <w:rFonts w:ascii="Arial" w:hAnsi="Arial" w:cs="Arial"/>
+        </w:rPr>
+        <w:tab/>
+        <w:t>Ejemplo de la consola del servidor y la consola del PuTTY:</w:t>
       </w:r>
     </w:p>
     <w:p>
@@ -2295,10 +2070,10 @@
           <w:rFonts w:ascii="Arial" w:hAnsi="Arial" w:cs="Arial"/>
         </w:rPr>
         <w:drawing>
-          <wp:inline distT="0" distB="0" distL="0" distR="0" wp14:anchorId="6FAA73AD" wp14:editId="3B536276">
-            <wp:extent cx="4810125" cy="3039664"/>
-            <wp:effectExtent l="0" t="0" r="0" b="8890"/>
-            <wp:docPr id="1627900763" name="Imagen 1" descr="Texto&#10;&#10;El contenido generado por IA puede ser incorrecto."/>
+          <wp:inline distT="0" distB="0" distL="0" distR="0" wp14:anchorId="48125EF1" wp14:editId="6565DFDE">
+            <wp:extent cx="5612130" cy="3180715"/>
+            <wp:effectExtent l="0" t="0" r="7620" b="635"/>
+            <wp:docPr id="147720730" name="Imagen 1" descr="Interfaz de usuario gráfica, Texto&#10;&#10;El contenido generado por IA puede ser incorrecto."/>
             <wp:cNvGraphicFramePr>
               <a:graphicFrameLocks xmlns:a="http://schemas.openxmlformats.org/drawingml/2006/main" noChangeAspect="1"/>
             </wp:cNvGraphicFramePr>
@@ -2306,7 +2081,7 @@
               <a:graphicData uri="http://schemas.openxmlformats.org/drawingml/2006/picture">
                 <pic:pic xmlns:pic="http://schemas.openxmlformats.org/drawingml/2006/picture">
                   <pic:nvPicPr>
-                    <pic:cNvPr id="1627900763" name="Imagen 1" descr="Texto&#10;&#10;El contenido generado por IA puede ser incorrecto."/>
+                    <pic:cNvPr id="147720730" name="Imagen 1" descr="Interfaz de usuario gráfica, Texto&#10;&#10;El contenido generado por IA puede ser incorrecto."/>
                     <pic:cNvPicPr/>
                   </pic:nvPicPr>
                   <pic:blipFill>
@@ -2318,7 +2093,7 @@
                   <pic:spPr>
                     <a:xfrm>
                       <a:off x="0" y="0"/>
-                      <a:ext cx="4814851" cy="3042651"/>
+                      <a:ext cx="5612130" cy="3180715"/>
                     </a:xfrm>
                     <a:prstGeom prst="rect">
                       <a:avLst/>
@@ -2341,95 +2116,34 @@
         <w:rPr>
           <w:rFonts w:ascii="Arial" w:hAnsi="Arial" w:cs="Arial"/>
         </w:rPr>
-        <w:t>DHCP + Cliente</w:t>
-      </w:r>
-    </w:p>
-    <w:p>
-      <w:pPr>
-        <w:rPr>
-          <w:rFonts w:ascii="Arial" w:hAnsi="Arial" w:cs="Arial"/>
-          <w:b/>
-          <w:bCs/>
-        </w:rPr>
-      </w:pPr>
-      <w:r>
-        <w:rPr>
-          <w:rFonts w:ascii="Arial" w:hAnsi="Arial" w:cs="Arial"/>
-          <w:b/>
-          <w:bCs/>
-        </w:rPr>
-        <w:drawing>
-          <wp:inline distT="0" distB="0" distL="0" distR="0" wp14:anchorId="308C6F57" wp14:editId="50152068">
-            <wp:extent cx="5612130" cy="2424430"/>
-            <wp:effectExtent l="0" t="0" r="7620" b="0"/>
-            <wp:docPr id="34040969" name="Imagen 1"/>
-            <wp:cNvGraphicFramePr>
-              <a:graphicFrameLocks xmlns:a="http://schemas.openxmlformats.org/drawingml/2006/main" noChangeAspect="1"/>
-            </wp:cNvGraphicFramePr>
-            <a:graphic xmlns:a="http://schemas.openxmlformats.org/drawingml/2006/main">
-              <a:graphicData uri="http://schemas.openxmlformats.org/drawingml/2006/picture">
-                <pic:pic xmlns:pic="http://schemas.openxmlformats.org/drawingml/2006/picture">
-                  <pic:nvPicPr>
-                    <pic:cNvPr id="34040969" name=""/>
-                    <pic:cNvPicPr/>
-                  </pic:nvPicPr>
-                  <pic:blipFill>
-                    <a:blip r:embed="rId14"/>
-                    <a:stretch>
-                      <a:fillRect/>
-                    </a:stretch>
-                  </pic:blipFill>
-                  <pic:spPr>
-                    <a:xfrm>
-                      <a:off x="0" y="0"/>
-                      <a:ext cx="5612130" cy="2424430"/>
-                    </a:xfrm>
-                    <a:prstGeom prst="rect">
-                      <a:avLst/>
-                    </a:prstGeom>
-                  </pic:spPr>
-                </pic:pic>
-              </a:graphicData>
-            </a:graphic>
-          </wp:inline>
-        </w:drawing>
-      </w:r>
-    </w:p>
-    <w:p>
-      <w:pPr>
-        <w:rPr>
-          <w:rFonts w:ascii="Arial" w:hAnsi="Arial" w:cs="Arial"/>
-          <w:b/>
-          <w:bCs/>
-        </w:rPr>
-      </w:pPr>
-    </w:p>
-    <w:p>
-      <w:pPr>
-        <w:rPr>
-          <w:rFonts w:ascii="Arial" w:hAnsi="Arial" w:cs="Arial"/>
-          <w:b/>
-          <w:bCs/>
-        </w:rPr>
-      </w:pPr>
-    </w:p>
-    <w:p>
-      <w:pPr>
-        <w:rPr>
-          <w:rFonts w:ascii="Arial" w:hAnsi="Arial" w:cs="Arial"/>
-          <w:b/>
-          <w:bCs/>
-        </w:rPr>
-      </w:pPr>
-    </w:p>
-    <w:p>
-      <w:pPr>
-        <w:rPr>
-          <w:rFonts w:ascii="Arial" w:hAnsi="Arial" w:cs="Arial"/>
-          <w:b/>
-          <w:bCs/>
-        </w:rPr>
-      </w:pPr>
+        <w:lastRenderedPageBreak/>
+        <w:tab/>
+        <w:t>PD: De esta manera ya se puede controlar todo el servidor desde la maquina host sin necesidad de tocar la consola del servidor, esto servirá para futuras practicas además de también poder transferir archivos via ssh.</w:t>
+      </w:r>
+    </w:p>
+    <w:p>
+      <w:pPr>
+        <w:rPr>
+          <w:rFonts w:ascii="Arial" w:hAnsi="Arial" w:cs="Arial"/>
+        </w:rPr>
+      </w:pPr>
+    </w:p>
+    <w:p>
+      <w:pPr>
+        <w:rPr>
+          <w:rFonts w:ascii="Arial" w:hAnsi="Arial" w:cs="Arial"/>
+          <w:b/>
+          <w:bCs/>
+        </w:rPr>
+      </w:pPr>
+      <w:r>
+        <w:rPr>
+          <w:rFonts w:ascii="Arial" w:hAnsi="Arial" w:cs="Arial"/>
+          <w:b/>
+          <w:bCs/>
+        </w:rPr>
+        <w:t>DATO IMPORTANTE: Las pruebas de Windows es de la misma manera, es un script bastante similar y funciona de manera idéntica.</w:t>
+      </w:r>
     </w:p>
     <w:p>
       <w:pPr>
@@ -2467,7 +2181,6 @@
           <w:sz w:val="28"/>
           <w:szCs w:val="28"/>
         </w:rPr>
-        <w:lastRenderedPageBreak/>
         <w:t>Conclusiones y Referencias</w:t>
       </w:r>
     </w:p>
@@ -2497,19 +2210,19 @@
         <w:rPr>
           <w:rFonts w:ascii="Arial" w:hAnsi="Arial" w:cs="Arial"/>
         </w:rPr>
-        <w:t xml:space="preserve">Aprendí que debo </w:t>
-      </w:r>
-      <w:r>
-        <w:rPr>
-          <w:rFonts w:ascii="Arial" w:hAnsi="Arial" w:cs="Arial"/>
-        </w:rPr>
-        <w:t>darles</w:t>
-      </w:r>
-      <w:r>
-        <w:rPr>
-          <w:rFonts w:ascii="Arial" w:hAnsi="Arial" w:cs="Arial"/>
-        </w:rPr>
-        <w:t xml:space="preserve"> mas tiempo a estas tareas, el uso de bash y powershell a este nivel de programación es mas lento de lo esperado pero al final me siento satisfecho con el conocimiento adquirido y mejorado con esta actividad.</w:t>
+        <w:t xml:space="preserve">Aprendí </w:t>
+      </w:r>
+      <w:r>
+        <w:rPr>
+          <w:rFonts w:ascii="Arial" w:hAnsi="Arial" w:cs="Arial"/>
+        </w:rPr>
+        <w:t>a utilizar el servicio ssh para la transferencia de archivos entre servidores, además de poderse conectar de manera remota ayuda mucho a tener mejor comunicación o de manera más cómoda, de esta manera las futuras pruebas de futuras practicas serán más fáciles de hacer sin necesidad de commitear tanto en github para luego descargar los cambios en el servidor, de esta manera estará más claro el rango y cambios de trabajo en github</w:t>
+      </w:r>
+      <w:r>
+        <w:rPr>
+          <w:rFonts w:ascii="Arial" w:hAnsi="Arial" w:cs="Arial"/>
+        </w:rPr>
+        <w:t>.</w:t>
       </w:r>
     </w:p>
     <w:p>
@@ -2540,43 +2253,6 @@
           <w:rFonts w:ascii="Arial" w:hAnsi="Arial" w:cs="Arial"/>
         </w:rPr>
         <w:t>https://github.com/Dany1912-dev/administracion_sistemas/commits/main/</w:t>
-      </w:r>
-    </w:p>
-    <w:p/>
-    <w:p>
-      <w:hyperlink r:id="rId15" w:history="1">
-        <w:r>
-          <w:rPr>
-            <w:rStyle w:val="Hipervnculo"/>
-          </w:rPr>
-          <w:t>https://linuxconfig.org/what-is-dhcp-and-how-toconfigure-dhcp-server-in-linux</w:t>
-        </w:r>
-      </w:hyperlink>
-      <w:r>
-        <w:t xml:space="preserve"> </w:t>
-      </w:r>
-    </w:p>
-    <w:p>
-      <w:hyperlink r:id="rId16" w:history="1">
-        <w:r>
-          <w:rPr>
-            <w:rStyle w:val="Hipervnculo"/>
-          </w:rPr>
-          <w:t>https://kodekloud.com/blog/regex-shell-script/</w:t>
-        </w:r>
-      </w:hyperlink>
-      <w:r>
-        <w:t xml:space="preserve"> </w:t>
-      </w:r>
-    </w:p>
-    <w:p>
-      <w:r>
-        <w:t xml:space="preserve">https://learn.microsoft.com/eses/windowsserver/networking/technologies/dhcp/quickstart-install-configuredhcp-server?tabs=powershell </w:t>
-      </w:r>
-    </w:p>
-    <w:p>
-      <w:r>
-        <w:t>https://www.w3schools.com/bash/</w:t>
       </w:r>
     </w:p>
     <w:sectPr>

</xml_diff>